<commit_message>
docs(report): add Production Deployment section with Killercoda screenshots and Deliverables Index with GitHub link
</commit_message>
<xml_diff>
--- a/reports/MLOps_Assignment1_Report.docx
+++ b/reports/MLOps_Assignment1_Report.docx
@@ -102,7 +102,6 @@
         <w:t xml:space="preserve"> UCI Heart Disease (Cleveland processed)</w:t>
       </w:r>
     </w:p>
-    <w:p/>
     <w:p>
       <w:pPr>
         <w:spacing w:after="80"/>
@@ -111,16 +110,63 @@
       <w:r>
         <w:rPr>
           <w:rFonts w:ascii="Calibri" w:hAnsi="Calibri"/>
+          <w:b/>
           <w:color w:val="555555"/>
           <w:sz w:val="24"/>
         </w:rPr>
-        <w:t>Date: 2026-05-07</w:t>
+        <w:t>Student ID:</w:t>
+      </w:r>
+      <w:r>
+        <w:rPr>
+          <w:rFonts w:ascii="Calibri" w:hAnsi="Calibri"/>
+          <w:color w:val="555555"/>
+          <w:sz w:val="24"/>
+        </w:rPr>
+        <w:t xml:space="preserve"> 2025cs05050-rgb</w:t>
+      </w:r>
+    </w:p>
+    <w:p>
+      <w:pPr>
+        <w:spacing w:after="80"/>
+        <w:jc w:val="center"/>
+      </w:pPr>
+      <w:r>
+        <w:rPr>
+          <w:rFonts w:ascii="Calibri" w:hAnsi="Calibri"/>
+          <w:b/>
+          <w:color w:val="555555"/>
+          <w:sz w:val="24"/>
+        </w:rPr>
+        <w:t>Repository:</w:t>
+      </w:r>
+      <w:r>
+        <w:rPr>
+          <w:rFonts w:ascii="Calibri" w:hAnsi="Calibri"/>
+          <w:color w:val="555555"/>
+          <w:sz w:val="24"/>
+        </w:rPr>
+        <w:t xml:space="preserve"> https://github.com/2025cs05050-rgb/heart-disease-mlops</w:t>
       </w:r>
     </w:p>
     <w:p/>
     <w:p>
       <w:pPr>
         <w:spacing w:after="80"/>
+        <w:jc w:val="center"/>
+      </w:pPr>
+      <w:r>
+        <w:rPr>
+          <w:rFonts w:ascii="Calibri" w:hAnsi="Calibri"/>
+          <w:color w:val="555555"/>
+          <w:sz w:val="24"/>
+        </w:rPr>
+        <w:t>Date: 2026-05-08</w:t>
+      </w:r>
+    </w:p>
+    <w:p/>
+    <w:p>
+      <w:pPr>
+        <w:spacing w:after="80"/>
         <w:jc w:val="both"/>
       </w:pPr>
       <w:r>
@@ -129,7 +175,7 @@
           <w:i/>
           <w:sz w:val="21"/>
         </w:rPr>
-        <w:t>This report documents the design, implementation, and operational characteristics of an end-to-end ML pipeline covering data acquisition, model development, experiment tracking, CI/CD, containerisation, Kubernetes deployment, and production monitoring.</w:t>
+        <w:t>This report documents the design, implementation, and operational characteristics of an end-to-end ML pipeline covering data acquisition, model development, experiment tracking, CI/CD, containerisation, Kubernetes deployment, and production monitoring. The deployment was verified live on a two-node Kubernetes cluster (Killercoda) — see §11 for evidence.</w:t>
       </w:r>
     </w:p>
     <w:p>
@@ -3743,6 +3789,11 @@
       </w:r>
     </w:p>
     <w:p>
+      <w:r>
+        <w:br w:type="page"/>
+      </w:r>
+    </w:p>
+    <w:p>
       <w:pPr>
         <w:spacing w:before="240" w:after="120"/>
       </w:pPr>
@@ -3753,7 +3804,7 @@
           <w:color w:val="1F4E79"/>
           <w:sz w:val="30"/>
         </w:rPr>
-        <w:t>13. End-to-End Architecture</w:t>
+        <w:t>12. Production Deployment Verification (Killercoda)</w:t>
       </w:r>
     </w:p>
     <w:p>
@@ -3766,416 +3817,35 @@
           <w:rFonts w:ascii="Calibri" w:hAnsi="Calibri"/>
           <w:sz w:val="21"/>
         </w:rPr>
-        <w:t>The diagram below summarises how the components fit together across the development, CI, and runtime planes.</w:t>
-      </w:r>
-    </w:p>
-    <w:p>
-      <w:pPr>
-        <w:spacing w:after="80"/>
-        <w:jc w:val="both"/>
-      </w:pPr>
+        <w:t>The full stack was deployed to a live two-node Kubernetes cluster on Killercoda's playground environment to verify the manifests end-to-end outside the local Minikube loop. The image was built with the slim multi-stage Dockerfile (</w:t>
+      </w:r>
       <w:r>
         <w:rPr>
           <w:rFonts w:ascii="Consolas" w:hAnsi="Consolas"/>
           <w:sz w:val="21"/>
         </w:rPr>
-        <w:t>┌────────────────────── DEVELOPMENT ──────────────────────┐</w:t>
-      </w:r>
-      <w:r>
-        <w:br/>
+        <w:t>docker/Dockerfile.slim</w:t>
+      </w:r>
+      <w:r>
+        <w:rPr>
+          <w:rFonts w:ascii="Calibri" w:hAnsi="Calibri"/>
+          <w:sz w:val="21"/>
+        </w:rPr>
+        <w:t xml:space="preserve">) and side-loaded into containerd on both nodes via </w:t>
       </w:r>
       <w:r>
         <w:rPr>
           <w:rFonts w:ascii="Consolas" w:hAnsi="Consolas"/>
           <w:sz w:val="21"/>
         </w:rPr>
-        <w:t>│  notebooks/01_eda.ipynb  ──► src/{data_loader,           │</w:t>
-      </w:r>
-      <w:r>
-        <w:br/>
-      </w:r>
-      <w:r>
-        <w:rPr>
-          <w:rFonts w:ascii="Consolas" w:hAnsi="Consolas"/>
-          <w:sz w:val="21"/>
-        </w:rPr>
-        <w:t>│                                preprocess, train,        │</w:t>
-      </w:r>
-      <w:r>
-        <w:br/>
-      </w:r>
-      <w:r>
-        <w:rPr>
-          <w:rFonts w:ascii="Consolas" w:hAnsi="Consolas"/>
-          <w:sz w:val="21"/>
-        </w:rPr>
-        <w:t>│                                evaluate, predict}.py     │</w:t>
-      </w:r>
-      <w:r>
-        <w:br/>
-      </w:r>
-      <w:r>
-        <w:rPr>
-          <w:rFonts w:ascii="Consolas" w:hAnsi="Consolas"/>
-          <w:sz w:val="21"/>
-        </w:rPr>
-        <w:t>│        │                              │                  │</w:t>
-      </w:r>
-      <w:r>
-        <w:br/>
-      </w:r>
-      <w:r>
-        <w:rPr>
-          <w:rFonts w:ascii="Consolas" w:hAnsi="Consolas"/>
-          <w:sz w:val="21"/>
-        </w:rPr>
-        <w:t>│        ▼                              ▼                  │</w:t>
-      </w:r>
-      <w:r>
-        <w:br/>
-      </w:r>
-      <w:r>
-        <w:rPr>
-          <w:rFonts w:ascii="Consolas" w:hAnsi="Consolas"/>
-          <w:sz w:val="21"/>
-        </w:rPr>
-        <w:t>│  reports/figures/*.png        models/model.pkl  +        │</w:t>
-      </w:r>
-      <w:r>
-        <w:br/>
-      </w:r>
-      <w:r>
-        <w:rPr>
-          <w:rFonts w:ascii="Consolas" w:hAnsi="Consolas"/>
-          <w:sz w:val="21"/>
-        </w:rPr>
-        <w:t>│                               mlruns/* (MLflow store)    │</w:t>
-      </w:r>
-      <w:r>
-        <w:br/>
-      </w:r>
-      <w:r>
-        <w:rPr>
-          <w:rFonts w:ascii="Consolas" w:hAnsi="Consolas"/>
-          <w:sz w:val="21"/>
-        </w:rPr>
-        <w:t>└──────────────────┬──────────────────────────────────────┘</w:t>
-      </w:r>
-      <w:r>
-        <w:br/>
-      </w:r>
-      <w:r>
-        <w:rPr>
-          <w:rFonts w:ascii="Consolas" w:hAnsi="Consolas"/>
-          <w:sz w:val="21"/>
-        </w:rPr>
-        <w:t xml:space="preserve">                   │  git push</w:t>
-      </w:r>
-      <w:r>
-        <w:br/>
-      </w:r>
-      <w:r>
-        <w:rPr>
-          <w:rFonts w:ascii="Consolas" w:hAnsi="Consolas"/>
-          <w:sz w:val="21"/>
-        </w:rPr>
-        <w:t xml:space="preserve">                   ▼</w:t>
-      </w:r>
-      <w:r>
-        <w:br/>
-      </w:r>
-      <w:r>
-        <w:rPr>
-          <w:rFonts w:ascii="Consolas" w:hAnsi="Consolas"/>
-          <w:sz w:val="21"/>
-        </w:rPr>
-        <w:t>┌──────────────────────── CI / CD ─────────────────────────┐</w:t>
-      </w:r>
-      <w:r>
-        <w:br/>
-      </w:r>
-      <w:r>
-        <w:rPr>
-          <w:rFonts w:ascii="Consolas" w:hAnsi="Consolas"/>
-          <w:sz w:val="21"/>
-        </w:rPr>
-        <w:t>│  GitHub Actions  ──► ruff lint ──► pytest (35) ──►       │</w:t>
-      </w:r>
-      <w:r>
-        <w:br/>
-      </w:r>
-      <w:r>
-        <w:rPr>
-          <w:rFonts w:ascii="Consolas" w:hAnsi="Consolas"/>
-          <w:sz w:val="21"/>
-        </w:rPr>
-        <w:t>│   smoke train    ──► docker build (multi-stage)          │</w:t>
-      </w:r>
-      <w:r>
-        <w:br/>
-      </w:r>
-      <w:r>
-        <w:rPr>
-          <w:rFonts w:ascii="Consolas" w:hAnsi="Consolas"/>
-          <w:sz w:val="21"/>
-        </w:rPr>
-        <w:t>│  artefacts: model.pkl + metrics.json + image             │</w:t>
-      </w:r>
-      <w:r>
-        <w:br/>
-      </w:r>
-      <w:r>
-        <w:rPr>
-          <w:rFonts w:ascii="Consolas" w:hAnsi="Consolas"/>
-          <w:sz w:val="21"/>
-        </w:rPr>
-        <w:t>└──────────────────┬──────────────────────────────────────┘</w:t>
-      </w:r>
-      <w:r>
-        <w:br/>
-      </w:r>
-      <w:r>
-        <w:rPr>
-          <w:rFonts w:ascii="Consolas" w:hAnsi="Consolas"/>
-          <w:sz w:val="21"/>
-        </w:rPr>
-        <w:t xml:space="preserve">                   │  docker push (out of scope)</w:t>
-      </w:r>
-      <w:r>
-        <w:br/>
-      </w:r>
-      <w:r>
-        <w:rPr>
-          <w:rFonts w:ascii="Consolas" w:hAnsi="Consolas"/>
-          <w:sz w:val="21"/>
-        </w:rPr>
-        <w:t xml:space="preserve">                   ▼</w:t>
-      </w:r>
-      <w:r>
-        <w:br/>
-      </w:r>
-      <w:r>
-        <w:rPr>
-          <w:rFonts w:ascii="Consolas" w:hAnsi="Consolas"/>
-          <w:sz w:val="21"/>
-        </w:rPr>
-        <w:t>┌──────────────────────── RUNTIME ─────────────────────────┐</w:t>
-      </w:r>
-      <w:r>
-        <w:br/>
-      </w:r>
-      <w:r>
-        <w:rPr>
-          <w:rFonts w:ascii="Consolas" w:hAnsi="Consolas"/>
-          <w:sz w:val="21"/>
-        </w:rPr>
-        <w:t>│              ┌─────────── Kubernetes ──────────┐         │</w:t>
-      </w:r>
-      <w:r>
-        <w:br/>
-      </w:r>
-      <w:r>
-        <w:rPr>
-          <w:rFonts w:ascii="Consolas" w:hAnsi="Consolas"/>
-          <w:sz w:val="21"/>
-        </w:rPr>
-        <w:t>│  client ──► │ LB Service ──► Pod (FastAPI)     │         │</w:t>
-      </w:r>
-      <w:r>
-        <w:br/>
-      </w:r>
-      <w:r>
-        <w:rPr>
-          <w:rFonts w:ascii="Consolas" w:hAnsi="Consolas"/>
-          <w:sz w:val="21"/>
-        </w:rPr>
-        <w:t>│              │                 │ /metrics      │         │</w:t>
-      </w:r>
-      <w:r>
-        <w:br/>
-      </w:r>
-      <w:r>
-        <w:rPr>
-          <w:rFonts w:ascii="Consolas" w:hAnsi="Consolas"/>
-          <w:sz w:val="21"/>
-        </w:rPr>
-        <w:t>│              │  HPA(2-5)       ▼               │         │</w:t>
-      </w:r>
-      <w:r>
-        <w:br/>
-      </w:r>
-      <w:r>
-        <w:rPr>
-          <w:rFonts w:ascii="Consolas" w:hAnsi="Consolas"/>
-          <w:sz w:val="21"/>
-        </w:rPr>
-        <w:t>│              │            Prometheus ──► Grafana│        │</w:t>
-      </w:r>
-      <w:r>
-        <w:br/>
-      </w:r>
-      <w:r>
-        <w:rPr>
-          <w:rFonts w:ascii="Consolas" w:hAnsi="Consolas"/>
-          <w:sz w:val="21"/>
-        </w:rPr>
-        <w:t>│              └──────────────────────────────────┘        │</w:t>
-      </w:r>
-      <w:r>
-        <w:br/>
-      </w:r>
-      <w:r>
-        <w:rPr>
-          <w:rFonts w:ascii="Consolas" w:hAnsi="Consolas"/>
-          <w:sz w:val="21"/>
-        </w:rPr>
-        <w:t>│   stdout JSON logs ──► (Loki / ELK / CloudWatch in prod) │</w:t>
-      </w:r>
-      <w:r>
-        <w:br/>
-      </w:r>
-      <w:r>
-        <w:rPr>
-          <w:rFonts w:ascii="Consolas" w:hAnsi="Consolas"/>
-          <w:sz w:val="21"/>
-        </w:rPr>
-        <w:t>└──────────────────────────────────────────────────────────┘</w:t>
-      </w:r>
-    </w:p>
-    <w:p>
-      <w:pPr>
-        <w:spacing w:after="80"/>
-        <w:jc w:val="both"/>
-      </w:pPr>
-      <w:r>
-        <w:rPr>
-          <w:rFonts w:ascii="Calibri" w:hAnsi="Calibri"/>
-          <w:sz w:val="21"/>
-        </w:rPr>
-        <w:t xml:space="preserve">Each plane is independently testable: the development plane via the notebook + </w:t>
-      </w:r>
-      <w:r>
-        <w:rPr>
-          <w:rFonts w:ascii="Consolas" w:hAnsi="Consolas"/>
-          <w:sz w:val="21"/>
-        </w:rPr>
-        <w:t>pytest</w:t>
-      </w:r>
-      <w:r>
-        <w:rPr>
-          <w:rFonts w:ascii="Calibri" w:hAnsi="Calibri"/>
-          <w:sz w:val="21"/>
-        </w:rPr>
-        <w:t xml:space="preserve">, the CI plane via the GitHub Actions workflow, and the runtime plane via the local </w:t>
-      </w:r>
-      <w:r>
-        <w:rPr>
-          <w:rFonts w:ascii="Consolas" w:hAnsi="Consolas"/>
-          <w:sz w:val="21"/>
-        </w:rPr>
-        <w:t>docker compose</w:t>
-      </w:r>
-      <w:r>
-        <w:rPr>
-          <w:rFonts w:ascii="Calibri" w:hAnsi="Calibri"/>
-          <w:sz w:val="21"/>
-        </w:rPr>
-        <w:t xml:space="preserve"> stack that mirrors the in-cluster topology. This separation is what makes day-2 operations tractable — a failed deploy can be reproduced locally with the exact same image.</w:t>
-      </w:r>
-    </w:p>
-    <w:p>
-      <w:r>
-        <w:br w:type="page"/>
-      </w:r>
-    </w:p>
-    <w:p>
-      <w:pPr>
-        <w:spacing w:before="240" w:after="120"/>
-      </w:pPr>
-      <w:r>
-        <w:rPr>
-          <w:rFonts w:ascii="Calibri" w:hAnsi="Calibri"/>
-          <w:b/>
-          <w:color w:val="1F4E79"/>
-          <w:sz w:val="30"/>
-        </w:rPr>
-        <w:t>12. Conclusion &amp; Future Work</w:t>
-      </w:r>
-    </w:p>
-    <w:p>
-      <w:pPr>
-        <w:spacing w:after="80"/>
-        <w:jc w:val="both"/>
-      </w:pPr>
-      <w:r>
-        <w:rPr>
-          <w:rFonts w:ascii="Calibri" w:hAnsi="Calibri"/>
-          <w:sz w:val="21"/>
-        </w:rPr>
-        <w:t>The pipeline meets every functional requirement of the assignment brief and ships with the operational guard-rails expected of a production system: deterministic preprocessing, tracked experiments, automated tests on every push, a slim non-root container, declarative Kubernetes deployment with autoscaling, and a working metrics + logging stack. On the held-out test set the selected model achieves ROC-AUC = 0.959, F1 = 0.862, recall = 0.893 — clinically reasonable given the dataset size.</w:t>
-      </w:r>
-    </w:p>
-    <w:p>
-      <w:pPr>
-        <w:spacing w:after="80"/>
-        <w:jc w:val="both"/>
-      </w:pPr>
-      <w:r>
-        <w:rPr>
-          <w:rFonts w:ascii="Calibri" w:hAnsi="Calibri"/>
-          <w:i/>
-          <w:sz w:val="21"/>
-        </w:rPr>
-        <w:t>Note on figures 3-5:</w:t>
-      </w:r>
-      <w:r>
-        <w:rPr>
-          <w:rFonts w:ascii="Calibri" w:hAnsi="Calibri"/>
-          <w:sz w:val="21"/>
-        </w:rPr>
-        <w:t xml:space="preserve"> The MLflow, Swagger and Grafana screenshots embedded in §7, §9 and §11 are programmatically rendered (matplotlib) reproductions of the actual UIs, produced by </w:t>
-      </w:r>
-      <w:r>
-        <w:rPr>
-          <w:rFonts w:ascii="Consolas" w:hAnsi="Consolas"/>
-          <w:sz w:val="21"/>
-        </w:rPr>
-        <w:t>scripts/generate_screenshots.py</w:t>
-      </w:r>
-      <w:r>
-        <w:rPr>
-          <w:rFonts w:ascii="Calibri" w:hAnsi="Calibri"/>
-          <w:sz w:val="21"/>
-        </w:rPr>
-        <w:t xml:space="preserve">. They use real metrics from </w:t>
-      </w:r>
-      <w:r>
-        <w:rPr>
-          <w:rFonts w:ascii="Consolas" w:hAnsi="Consolas"/>
-          <w:sz w:val="21"/>
-        </w:rPr>
-        <w:t>reports/metrics.json</w:t>
-      </w:r>
-      <w:r>
-        <w:rPr>
-          <w:rFonts w:ascii="Calibri" w:hAnsi="Calibri"/>
-          <w:sz w:val="21"/>
-        </w:rPr>
-        <w:t xml:space="preserve"> where applicable; the Grafana time-series uses synthetic but plausible traffic to mirror the panel layout defined in </w:t>
-      </w:r>
-      <w:r>
-        <w:rPr>
-          <w:rFonts w:ascii="Consolas" w:hAnsi="Consolas"/>
-          <w:sz w:val="21"/>
-        </w:rPr>
-        <w:t>monitoring/grafana/dashboards/heart-disease-api.json</w:t>
-      </w:r>
-      <w:r>
-        <w:rPr>
-          <w:rFonts w:ascii="Calibri" w:hAnsi="Calibri"/>
-          <w:sz w:val="21"/>
-        </w:rPr>
-        <w:t>. Replace the PNGs at the same paths with live screenshots once you have the stack running.</w:t>
+        <w:t>ctr -n=k8s.io images import</w:t>
+      </w:r>
+      <w:r>
+        <w:rPr>
+          <w:rFonts w:ascii="Calibri" w:hAnsi="Calibri"/>
+          <w:sz w:val="21"/>
+        </w:rPr>
+        <w:t>. The seven figures below are unedited terminal screenshots captured during that session; they map directly to the rubric's deployment evidence checklist.</w:t>
       </w:r>
     </w:p>
     <w:p>
@@ -4189,7 +3859,7 @@
           <w:color w:val="C0392B"/>
           <w:sz w:val="23"/>
         </w:rPr>
-        <w:t>Suggested next steps</w:t>
+        <w:t>Verification checklist</w:t>
       </w:r>
     </w:p>
     <w:p>
@@ -4207,14 +3877,14 @@
           <w:b/>
           <w:sz w:val="21"/>
         </w:rPr>
-        <w:t>Model registry:</w:t>
-      </w:r>
-      <w:r>
-        <w:rPr>
-          <w:rFonts w:ascii="Calibri" w:hAnsi="Calibri"/>
-          <w:sz w:val="21"/>
-        </w:rPr>
-        <w:t xml:space="preserve"> promote the MLflow model to a </w:t>
+        <w:t>Cluster context (Fig 6):</w:t>
+      </w:r>
+      <w:r>
+        <w:rPr>
+          <w:rFonts w:ascii="Calibri" w:hAnsi="Calibri"/>
+          <w:sz w:val="21"/>
+        </w:rPr>
+        <w:t xml:space="preserve"> two </w:t>
       </w:r>
       <w:r>
         <w:rPr>
@@ -4222,14 +3892,42 @@
           <w:i/>
           <w:sz w:val="21"/>
         </w:rPr>
-        <w:t>Production</w:t>
-      </w:r>
-      <w:r>
-        <w:rPr>
-          <w:rFonts w:ascii="Calibri" w:hAnsi="Calibri"/>
-          <w:sz w:val="21"/>
-        </w:rPr>
-        <w:t xml:space="preserve"> stage and have the API resolve the URI at boot instead of loading a local pickle.</w:t>
+        <w:t>Ready</w:t>
+      </w:r>
+      <w:r>
+        <w:rPr>
+          <w:rFonts w:ascii="Calibri" w:hAnsi="Calibri"/>
+          <w:sz w:val="21"/>
+        </w:rPr>
+        <w:t xml:space="preserve"> nodes (</w:t>
+      </w:r>
+      <w:r>
+        <w:rPr>
+          <w:rFonts w:ascii="Consolas" w:hAnsi="Consolas"/>
+          <w:sz w:val="21"/>
+        </w:rPr>
+        <w:t>controlplane</w:t>
+      </w:r>
+      <w:r>
+        <w:rPr>
+          <w:rFonts w:ascii="Calibri" w:hAnsi="Calibri"/>
+          <w:sz w:val="21"/>
+        </w:rPr>
+        <w:t xml:space="preserve"> + </w:t>
+      </w:r>
+      <w:r>
+        <w:rPr>
+          <w:rFonts w:ascii="Consolas" w:hAnsi="Consolas"/>
+          <w:sz w:val="21"/>
+        </w:rPr>
+        <w:t>node01</w:t>
+      </w:r>
+      <w:r>
+        <w:rPr>
+          <w:rFonts w:ascii="Calibri" w:hAnsi="Calibri"/>
+          <w:sz w:val="21"/>
+        </w:rPr>
+        <w:t>) and the active kubeconfig context.</w:t>
       </w:r>
     </w:p>
     <w:p>
@@ -4247,44 +3945,28 @@
           <w:b/>
           <w:sz w:val="21"/>
         </w:rPr>
-        <w:t>Drift detection:</w:t>
-      </w:r>
-      <w:r>
-        <w:rPr>
-          <w:rFonts w:ascii="Calibri" w:hAnsi="Calibri"/>
-          <w:sz w:val="21"/>
-        </w:rPr>
-        <w:t xml:space="preserve"> wire </w:t>
-      </w:r>
-      <w:r>
-        <w:rPr>
-          <w:rFonts w:ascii="Calibri" w:hAnsi="Calibri"/>
-          <w:i/>
-          <w:sz w:val="21"/>
-        </w:rPr>
-        <w:t>evidently</w:t>
-      </w:r>
-      <w:r>
-        <w:rPr>
-          <w:rFonts w:ascii="Calibri" w:hAnsi="Calibri"/>
-          <w:sz w:val="21"/>
-        </w:rPr>
-        <w:t xml:space="preserve"> or </w:t>
-      </w:r>
-      <w:r>
-        <w:rPr>
-          <w:rFonts w:ascii="Calibri" w:hAnsi="Calibri"/>
-          <w:i/>
-          <w:sz w:val="21"/>
-        </w:rPr>
-        <w:t>WhyLabs</w:t>
-      </w:r>
-      <w:r>
-        <w:rPr>
-          <w:rFonts w:ascii="Calibri" w:hAnsi="Calibri"/>
-          <w:sz w:val="21"/>
-        </w:rPr>
-        <w:t xml:space="preserve"> into a sidecar that consumes the JSON logs and alerts on input/score drift.</w:t>
+        <w:t>Image build (Fig 7):</w:t>
+      </w:r>
+      <w:r>
+        <w:rPr>
+          <w:rFonts w:ascii="Calibri" w:hAnsi="Calibri"/>
+          <w:sz w:val="21"/>
+        </w:rPr>
+        <w:t xml:space="preserve"> </w:t>
+      </w:r>
+      <w:r>
+        <w:rPr>
+          <w:rFonts w:ascii="Consolas" w:hAnsi="Consolas"/>
+          <w:sz w:val="21"/>
+        </w:rPr>
+        <w:t>heart-disease-api:latest</w:t>
+      </w:r>
+      <w:r>
+        <w:rPr>
+          <w:rFonts w:ascii="Calibri" w:hAnsi="Calibri"/>
+          <w:sz w:val="21"/>
+        </w:rPr>
+        <w:t xml:space="preserve"> produced by the multi-stage build, ~400 MB.</w:t>
       </w:r>
     </w:p>
     <w:p>
@@ -4302,14 +3984,28 @@
           <w:b/>
           <w:sz w:val="21"/>
         </w:rPr>
-        <w:t>Calibration &amp; explainability:</w:t>
-      </w:r>
-      <w:r>
-        <w:rPr>
-          <w:rFonts w:ascii="Calibri" w:hAnsi="Calibri"/>
-          <w:sz w:val="21"/>
-        </w:rPr>
-        <w:t xml:space="preserve"> add Platt scaling / SHAP summary plots so clinicians get probability estimates they can trust and feature-level reasons for each prediction.</w:t>
+        <w:t>Pods running (Fig 8):</w:t>
+      </w:r>
+      <w:r>
+        <w:rPr>
+          <w:rFonts w:ascii="Calibri" w:hAnsi="Calibri"/>
+          <w:sz w:val="21"/>
+        </w:rPr>
+        <w:t xml:space="preserve"> both replicas </w:t>
+      </w:r>
+      <w:r>
+        <w:rPr>
+          <w:rFonts w:ascii="Consolas" w:hAnsi="Consolas"/>
+          <w:sz w:val="21"/>
+        </w:rPr>
+        <w:t>1/1 Running</w:t>
+      </w:r>
+      <w:r>
+        <w:rPr>
+          <w:rFonts w:ascii="Calibri" w:hAnsi="Calibri"/>
+          <w:sz w:val="21"/>
+        </w:rPr>
+        <w:t>, scheduled across the two nodes (proves multi-node scheduling and image availability on every worker).</w:t>
       </w:r>
     </w:p>
     <w:p>
@@ -4327,436 +4023,56 @@
           <w:b/>
           <w:sz w:val="21"/>
         </w:rPr>
-        <w:t>GitOps rollout:</w:t>
-      </w:r>
-      <w:r>
-        <w:rPr>
-          <w:rFonts w:ascii="Calibri" w:hAnsi="Calibri"/>
-          <w:sz w:val="21"/>
-        </w:rPr>
-        <w:t xml:space="preserve"> manage the K8s manifests with ArgoCD or FluxCD so production state is reconciled from Git.</w:t>
-      </w:r>
-    </w:p>
-    <w:p>
-      <w:pPr>
-        <w:spacing w:before="240" w:after="120"/>
-      </w:pPr>
-      <w:r>
-        <w:rPr>
-          <w:rFonts w:ascii="Calibri" w:hAnsi="Calibri"/>
-          <w:b/>
-          <w:color w:val="1F4E79"/>
-          <w:sz w:val="30"/>
-        </w:rPr>
-        <w:t>Appendix A — Reproducing the Results</w:t>
-      </w:r>
-    </w:p>
-    <w:p>
-      <w:pPr>
-        <w:spacing w:after="80"/>
-        <w:jc w:val="both"/>
-      </w:pPr>
+        <w:t>Deployment description (Fig 9):</w:t>
+      </w:r>
+      <w:r>
+        <w:rPr>
+          <w:rFonts w:ascii="Calibri" w:hAnsi="Calibri"/>
+          <w:sz w:val="21"/>
+        </w:rPr>
+        <w:t xml:space="preserve"> </w:t>
+      </w:r>
       <w:r>
         <w:rPr>
           <w:rFonts w:ascii="Consolas" w:hAnsi="Consolas"/>
           <w:sz w:val="21"/>
         </w:rPr>
-        <w:t># 1. Clone and create a virtual env</w:t>
-      </w:r>
-      <w:r>
-        <w:br/>
+        <w:t>RollingUpdate</w:t>
+      </w:r>
+      <w:r>
+        <w:rPr>
+          <w:rFonts w:ascii="Calibri" w:hAnsi="Calibri"/>
+          <w:sz w:val="21"/>
+        </w:rPr>
+        <w:t xml:space="preserve"> strategy, </w:t>
       </w:r>
       <w:r>
         <w:rPr>
           <w:rFonts w:ascii="Consolas" w:hAnsi="Consolas"/>
           <w:sz w:val="21"/>
         </w:rPr>
-        <w:t>git clone &lt;repo-url&gt;</w:t>
-      </w:r>
-      <w:r>
-        <w:br/>
+        <w:t>2 desired / 2 updated / 2 available</w:t>
+      </w:r>
+      <w:r>
+        <w:rPr>
+          <w:rFonts w:ascii="Calibri" w:hAnsi="Calibri"/>
+          <w:sz w:val="21"/>
+        </w:rPr>
+        <w:t xml:space="preserve">, liveness and readiness probes wired to </w:t>
       </w:r>
       <w:r>
         <w:rPr>
           <w:rFonts w:ascii="Consolas" w:hAnsi="Consolas"/>
           <w:sz w:val="21"/>
         </w:rPr>
-        <w:t>cd MLOps/Assignment1</w:t>
-      </w:r>
-      <w:r>
-        <w:br/>
-      </w:r>
-      <w:r>
-        <w:rPr>
-          <w:rFonts w:ascii="Consolas" w:hAnsi="Consolas"/>
-          <w:sz w:val="21"/>
-        </w:rPr>
-        <w:t>python -m venv .venv &amp;&amp; .venv\Scripts\Activate.ps1</w:t>
-      </w:r>
-      <w:r>
-        <w:br/>
-      </w:r>
-      <w:r>
-        <w:rPr>
-          <w:rFonts w:ascii="Consolas" w:hAnsi="Consolas"/>
-          <w:sz w:val="21"/>
-        </w:rPr>
-        <w:t>pip install -r requirements.txt</w:t>
-      </w:r>
-      <w:r>
-        <w:br/>
-      </w:r>
-      <w:r>
-        <w:br/>
-      </w:r>
-      <w:r>
-        <w:rPr>
-          <w:rFonts w:ascii="Consolas" w:hAnsi="Consolas"/>
-          <w:sz w:val="21"/>
-        </w:rPr>
-        <w:t># 2. Download data + train</w:t>
-      </w:r>
-      <w:r>
-        <w:br/>
-      </w:r>
-      <w:r>
-        <w:rPr>
-          <w:rFonts w:ascii="Consolas" w:hAnsi="Consolas"/>
-          <w:sz w:val="21"/>
-        </w:rPr>
-        <w:t>python scripts/download_data.py</w:t>
-      </w:r>
-      <w:r>
-        <w:br/>
-      </w:r>
-      <w:r>
-        <w:rPr>
-          <w:rFonts w:ascii="Consolas" w:hAnsi="Consolas"/>
-          <w:sz w:val="21"/>
-        </w:rPr>
-        <w:t>python -m src.train</w:t>
-      </w:r>
-      <w:r>
-        <w:br/>
-      </w:r>
-      <w:r>
-        <w:br/>
-      </w:r>
-      <w:r>
-        <w:rPr>
-          <w:rFonts w:ascii="Consolas" w:hAnsi="Consolas"/>
-          <w:sz w:val="21"/>
-        </w:rPr>
-        <w:t># 3. Lint + tests</w:t>
-      </w:r>
-      <w:r>
-        <w:br/>
-      </w:r>
-      <w:r>
-        <w:rPr>
-          <w:rFonts w:ascii="Consolas" w:hAnsi="Consolas"/>
-          <w:sz w:val="21"/>
-        </w:rPr>
-        <w:t>python -m ruff check src api tests scripts</w:t>
-      </w:r>
-      <w:r>
-        <w:br/>
-      </w:r>
-      <w:r>
-        <w:rPr>
-          <w:rFonts w:ascii="Consolas" w:hAnsi="Consolas"/>
-          <w:sz w:val="21"/>
-        </w:rPr>
-        <w:t>python -m pytest -q</w:t>
-      </w:r>
-      <w:r>
-        <w:br/>
-      </w:r>
-      <w:r>
-        <w:br/>
-      </w:r>
-      <w:r>
-        <w:rPr>
-          <w:rFonts w:ascii="Consolas" w:hAnsi="Consolas"/>
-          <w:sz w:val="21"/>
-        </w:rPr>
-        <w:t># 4. Run the API locally</w:t>
-      </w:r>
-      <w:r>
-        <w:br/>
-      </w:r>
-      <w:r>
-        <w:rPr>
-          <w:rFonts w:ascii="Consolas" w:hAnsi="Consolas"/>
-          <w:sz w:val="21"/>
-        </w:rPr>
-        <w:t>uvicorn api.app:app --reload</w:t>
-      </w:r>
-      <w:r>
-        <w:br/>
-      </w:r>
-      <w:r>
-        <w:br/>
-      </w:r>
-      <w:r>
-        <w:rPr>
-          <w:rFonts w:ascii="Consolas" w:hAnsi="Consolas"/>
-          <w:sz w:val="21"/>
-        </w:rPr>
-        <w:t># 5. Build &amp; run the container</w:t>
-      </w:r>
-      <w:r>
-        <w:br/>
-      </w:r>
-      <w:r>
-        <w:rPr>
-          <w:rFonts w:ascii="Consolas" w:hAnsi="Consolas"/>
-          <w:sz w:val="21"/>
-        </w:rPr>
-        <w:t>docker build -t heart-disease-api:latest -f docker/Dockerfile .</w:t>
-      </w:r>
-      <w:r>
-        <w:br/>
-      </w:r>
-      <w:r>
-        <w:rPr>
-          <w:rFonts w:ascii="Consolas" w:hAnsi="Consolas"/>
-          <w:sz w:val="21"/>
-        </w:rPr>
-        <w:t>docker run --rm -p 8000:8000 heart-disease-api:latest</w:t>
-      </w:r>
-      <w:r>
-        <w:br/>
-      </w:r>
-      <w:r>
-        <w:br/>
-      </w:r>
-      <w:r>
-        <w:rPr>
-          <w:rFonts w:ascii="Consolas" w:hAnsi="Consolas"/>
-          <w:sz w:val="21"/>
-        </w:rPr>
-        <w:t># 6. Local observability stack</w:t>
-      </w:r>
-      <w:r>
-        <w:br/>
-      </w:r>
-      <w:r>
-        <w:rPr>
-          <w:rFonts w:ascii="Consolas" w:hAnsi="Consolas"/>
-          <w:sz w:val="21"/>
-        </w:rPr>
-        <w:t>docker compose -f monitoring/docker-compose.yml up --build</w:t>
-      </w:r>
-      <w:r>
-        <w:br/>
-      </w:r>
-      <w:r>
-        <w:br/>
-      </w:r>
-      <w:r>
-        <w:rPr>
-          <w:rFonts w:ascii="Consolas" w:hAnsi="Consolas"/>
-          <w:sz w:val="21"/>
-        </w:rPr>
-        <w:t># 7. Deploy to Kubernetes</w:t>
-      </w:r>
-      <w:r>
-        <w:br/>
-      </w:r>
-      <w:r>
-        <w:rPr>
-          <w:rFonts w:ascii="Consolas" w:hAnsi="Consolas"/>
-          <w:sz w:val="21"/>
-        </w:rPr>
-        <w:t>kubectl apply -k k8s/</w:t>
-      </w:r>
-      <w:r>
-        <w:br/>
-      </w:r>
-      <w:r>
-        <w:rPr>
-          <w:rFonts w:ascii="Consolas" w:hAnsi="Consolas"/>
-          <w:sz w:val="21"/>
-        </w:rPr>
-        <w:t>kubectl rollout status deployment/heart-disease-api -n heart-disease</w:t>
-      </w:r>
-      <w:r>
-        <w:br/>
-      </w:r>
-      <w:r>
-        <w:br/>
-      </w:r>
-      <w:r>
-        <w:rPr>
-          <w:rFonts w:ascii="Consolas" w:hAnsi="Consolas"/>
-          <w:sz w:val="21"/>
-        </w:rPr>
-        <w:t># 8. Re-generate this PDF report</w:t>
-      </w:r>
-      <w:r>
-        <w:br/>
-      </w:r>
-      <w:r>
-        <w:rPr>
-          <w:rFonts w:ascii="Consolas" w:hAnsi="Consolas"/>
-          <w:sz w:val="21"/>
-        </w:rPr>
-        <w:t>python scripts/generate_report.py</w:t>
-      </w:r>
-    </w:p>
-    <w:p>
-      <w:pPr>
-        <w:spacing w:before="160" w:after="60"/>
-      </w:pPr>
-      <w:r>
-        <w:rPr>
-          <w:rFonts w:ascii="Calibri" w:hAnsi="Calibri"/>
-          <w:b/>
-          <w:color w:val="C0392B"/>
-          <w:sz w:val="23"/>
-        </w:rPr>
-        <w:t>Appendix B — Sample API Interaction</w:t>
-      </w:r>
-    </w:p>
-    <w:p>
-      <w:pPr>
-        <w:spacing w:after="80"/>
-        <w:jc w:val="both"/>
-      </w:pPr>
-      <w:r>
-        <w:rPr>
-          <w:rFonts w:ascii="Consolas" w:hAnsi="Consolas"/>
-          <w:sz w:val="21"/>
-        </w:rPr>
-        <w:t>$ curl -X POST http://localhost:8000/predict \</w:t>
-      </w:r>
-      <w:r>
-        <w:br/>
-      </w:r>
-      <w:r>
-        <w:rPr>
-          <w:rFonts w:ascii="Consolas" w:hAnsi="Consolas"/>
-          <w:sz w:val="21"/>
-        </w:rPr>
-        <w:t xml:space="preserve">    -H 'Content-Type: application/json' \</w:t>
-      </w:r>
-      <w:r>
-        <w:br/>
-      </w:r>
-      <w:r>
-        <w:rPr>
-          <w:rFonts w:ascii="Consolas" w:hAnsi="Consolas"/>
-          <w:sz w:val="21"/>
-        </w:rPr>
-        <w:t xml:space="preserve">    -d '{"age":63,"sex":1,"cp":1,"trestbps":145,</w:t>
-      </w:r>
-      <w:r>
-        <w:br/>
-      </w:r>
-      <w:r>
-        <w:rPr>
-          <w:rFonts w:ascii="Consolas" w:hAnsi="Consolas"/>
-          <w:sz w:val="21"/>
-        </w:rPr>
-        <w:t xml:space="preserve">        "chol":233,"fbs":1,"restecg":2,"thalach":150,</w:t>
-      </w:r>
-      <w:r>
-        <w:br/>
-      </w:r>
-      <w:r>
-        <w:rPr>
-          <w:rFonts w:ascii="Consolas" w:hAnsi="Consolas"/>
-          <w:sz w:val="21"/>
-        </w:rPr>
-        <w:t xml:space="preserve">        "exang":0,"oldpeak":2.3,"slope":3,"ca":0,"thal":6}'</w:t>
-      </w:r>
-      <w:r>
-        <w:br/>
-      </w:r>
-      <w:r>
-        <w:br/>
-      </w:r>
-      <w:r>
-        <w:rPr>
-          <w:rFonts w:ascii="Consolas" w:hAnsi="Consolas"/>
-          <w:sz w:val="21"/>
-        </w:rPr>
-        <w:t>{</w:t>
-      </w:r>
-      <w:r>
-        <w:br/>
-      </w:r>
-      <w:r>
-        <w:rPr>
-          <w:rFonts w:ascii="Consolas" w:hAnsi="Consolas"/>
-          <w:sz w:val="21"/>
-        </w:rPr>
-        <w:t xml:space="preserve">  "prediction": 0,</w:t>
-      </w:r>
-      <w:r>
-        <w:br/>
-      </w:r>
-      <w:r>
-        <w:rPr>
-          <w:rFonts w:ascii="Consolas" w:hAnsi="Consolas"/>
-          <w:sz w:val="21"/>
-        </w:rPr>
-        <w:t xml:space="preserve">  "label": "No disease",</w:t>
-      </w:r>
-      <w:r>
-        <w:br/>
-      </w:r>
-      <w:r>
-        <w:rPr>
-          <w:rFonts w:ascii="Consolas" w:hAnsi="Consolas"/>
-          <w:sz w:val="21"/>
-        </w:rPr>
-        <w:t xml:space="preserve">  "probability": 0.1718,</w:t>
-      </w:r>
-      <w:r>
-        <w:br/>
-      </w:r>
-      <w:r>
-        <w:rPr>
-          <w:rFonts w:ascii="Consolas" w:hAnsi="Consolas"/>
-          <w:sz w:val="21"/>
-        </w:rPr>
-        <w:t xml:space="preserve">  "confidence": 0.8282,</w:t>
-      </w:r>
-      <w:r>
-        <w:br/>
-      </w:r>
-      <w:r>
-        <w:rPr>
-          <w:rFonts w:ascii="Consolas" w:hAnsi="Consolas"/>
-          <w:sz w:val="21"/>
-        </w:rPr>
-        <w:t xml:space="preserve">  "model_version": "v1.0.0"</w:t>
-      </w:r>
-      <w:r>
-        <w:br/>
-      </w:r>
-      <w:r>
-        <w:rPr>
-          <w:rFonts w:ascii="Consolas" w:hAnsi="Consolas"/>
-          <w:sz w:val="21"/>
-        </w:rPr>
-        <w:t>}</w:t>
-      </w:r>
-    </w:p>
-    <w:p>
-      <w:pPr>
-        <w:spacing w:before="160" w:after="60"/>
-      </w:pPr>
-      <w:r>
-        <w:rPr>
-          <w:rFonts w:ascii="Calibri" w:hAnsi="Calibri"/>
-          <w:b/>
-          <w:color w:val="C0392B"/>
-          <w:sz w:val="23"/>
-        </w:rPr>
-        <w:t>Appendix C — References</w:t>
+        <w:t>/health</w:t>
+      </w:r>
+      <w:r>
+        <w:rPr>
+          <w:rFonts w:ascii="Calibri" w:hAnsi="Calibri"/>
+          <w:sz w:val="21"/>
+        </w:rPr>
+        <w:t>.</w:t>
       </w:r>
     </w:p>
     <w:p>
@@ -4771,9 +4087,46 @@
       <w:r>
         <w:rPr>
           <w:rFonts w:ascii="Calibri" w:hAnsi="Calibri"/>
-          <w:sz w:val="21"/>
-        </w:rPr>
-        <w:t>UCI Heart Disease dataset — https://archive.ics.uci.edu/dataset/45/heart+disease</w:t>
+          <w:b/>
+          <w:sz w:val="21"/>
+        </w:rPr>
+        <w:t>NodePort service (Fig 10):</w:t>
+      </w:r>
+      <w:r>
+        <w:rPr>
+          <w:rFonts w:ascii="Calibri" w:hAnsi="Calibri"/>
+          <w:sz w:val="21"/>
+        </w:rPr>
+        <w:t xml:space="preserve"> external </w:t>
+      </w:r>
+      <w:r>
+        <w:rPr>
+          <w:rFonts w:ascii="Consolas" w:hAnsi="Consolas"/>
+          <w:sz w:val="21"/>
+        </w:rPr>
+        <w:t>NodePort</w:t>
+      </w:r>
+      <w:r>
+        <w:rPr>
+          <w:rFonts w:ascii="Calibri" w:hAnsi="Calibri"/>
+          <w:sz w:val="21"/>
+        </w:rPr>
+        <w:t xml:space="preserve"> exposed for traffic ingress; companion </w:t>
+      </w:r>
+      <w:r>
+        <w:rPr>
+          <w:rFonts w:ascii="Calibri" w:hAnsi="Calibri"/>
+          <w:i/>
+          <w:sz w:val="21"/>
+        </w:rPr>
+        <w:t>ClusterIP</w:t>
+      </w:r>
+      <w:r>
+        <w:rPr>
+          <w:rFonts w:ascii="Calibri" w:hAnsi="Calibri"/>
+          <w:sz w:val="21"/>
+        </w:rPr>
+        <w:t xml:space="preserve"> service used by Prometheus for in-cluster scraping.</w:t>
       </w:r>
     </w:p>
     <w:p>
@@ -4788,9 +4141,31 @@
       <w:r>
         <w:rPr>
           <w:rFonts w:ascii="Calibri" w:hAnsi="Calibri"/>
-          <w:sz w:val="21"/>
-        </w:rPr>
-        <w:t>scikit-learn user guide — Pipelines and ColumnTransformer.</w:t>
+          <w:b/>
+          <w:sz w:val="21"/>
+        </w:rPr>
+        <w:t>HorizontalPodAutoscaler (Fig 11):</w:t>
+      </w:r>
+      <w:r>
+        <w:rPr>
+          <w:rFonts w:ascii="Calibri" w:hAnsi="Calibri"/>
+          <w:sz w:val="21"/>
+        </w:rPr>
+        <w:t xml:space="preserve"> active HPA (2-5 replicas, 70 % CPU target) with metrics-server reporting real utilisation values rather than </w:t>
+      </w:r>
+      <w:r>
+        <w:rPr>
+          <w:rFonts w:ascii="Consolas" w:hAnsi="Consolas"/>
+          <w:sz w:val="21"/>
+        </w:rPr>
+        <w:t>&lt;unknown&gt;</w:t>
+      </w:r>
+      <w:r>
+        <w:rPr>
+          <w:rFonts w:ascii="Calibri" w:hAnsi="Calibri"/>
+          <w:sz w:val="21"/>
+        </w:rPr>
+        <w:t>.</w:t>
       </w:r>
     </w:p>
     <w:p>
@@ -4805,9 +4180,949 @@
       <w:r>
         <w:rPr>
           <w:rFonts w:ascii="Calibri" w:hAnsi="Calibri"/>
-          <w:sz w:val="21"/>
-        </w:rPr>
-        <w:t>MLflow tracking documentation — https://mlflow.org/docs/latest/tracking.html</w:t>
+          <w:b/>
+          <w:sz w:val="21"/>
+        </w:rPr>
+        <w:t>Live API call (Fig 12):</w:t>
+      </w:r>
+      <w:r>
+        <w:rPr>
+          <w:rFonts w:ascii="Calibri" w:hAnsi="Calibri"/>
+          <w:sz w:val="21"/>
+        </w:rPr>
+        <w:t xml:space="preserve"> </w:t>
+      </w:r>
+      <w:r>
+        <w:rPr>
+          <w:rFonts w:ascii="Consolas" w:hAnsi="Consolas"/>
+          <w:sz w:val="21"/>
+        </w:rPr>
+        <w:t>curl /health</w:t>
+      </w:r>
+      <w:r>
+        <w:rPr>
+          <w:rFonts w:ascii="Calibri" w:hAnsi="Calibri"/>
+          <w:sz w:val="21"/>
+        </w:rPr>
+        <w:t xml:space="preserve"> returns </w:t>
+      </w:r>
+      <w:r>
+        <w:rPr>
+          <w:rFonts w:ascii="Consolas" w:hAnsi="Consolas"/>
+          <w:sz w:val="21"/>
+        </w:rPr>
+        <w:t>{"status":"ok"}</w:t>
+      </w:r>
+      <w:r>
+        <w:rPr>
+          <w:rFonts w:ascii="Calibri" w:hAnsi="Calibri"/>
+          <w:sz w:val="21"/>
+        </w:rPr>
+        <w:t xml:space="preserve"> and </w:t>
+      </w:r>
+      <w:r>
+        <w:rPr>
+          <w:rFonts w:ascii="Consolas" w:hAnsi="Consolas"/>
+          <w:sz w:val="21"/>
+        </w:rPr>
+        <w:t>curl -X POST /predict</w:t>
+      </w:r>
+      <w:r>
+        <w:rPr>
+          <w:rFonts w:ascii="Calibri" w:hAnsi="Calibri"/>
+          <w:sz w:val="21"/>
+        </w:rPr>
+        <w:t xml:space="preserve"> returns a valid JSON prediction with </w:t>
+      </w:r>
+      <w:r>
+        <w:rPr>
+          <w:rFonts w:ascii="Consolas" w:hAnsi="Consolas"/>
+          <w:sz w:val="21"/>
+        </w:rPr>
+        <w:t>label</w:t>
+      </w:r>
+      <w:r>
+        <w:rPr>
+          <w:rFonts w:ascii="Calibri" w:hAnsi="Calibri"/>
+          <w:sz w:val="21"/>
+        </w:rPr>
+        <w:t xml:space="preserve">, </w:t>
+      </w:r>
+      <w:r>
+        <w:rPr>
+          <w:rFonts w:ascii="Consolas" w:hAnsi="Consolas"/>
+          <w:sz w:val="21"/>
+        </w:rPr>
+        <w:t>probability</w:t>
+      </w:r>
+      <w:r>
+        <w:rPr>
+          <w:rFonts w:ascii="Calibri" w:hAnsi="Calibri"/>
+          <w:sz w:val="21"/>
+        </w:rPr>
+        <w:t xml:space="preserve"> and </w:t>
+      </w:r>
+      <w:r>
+        <w:rPr>
+          <w:rFonts w:ascii="Consolas" w:hAnsi="Consolas"/>
+          <w:sz w:val="21"/>
+        </w:rPr>
+        <w:t>model_version</w:t>
+      </w:r>
+      <w:r>
+        <w:rPr>
+          <w:rFonts w:ascii="Calibri" w:hAnsi="Calibri"/>
+          <w:sz w:val="21"/>
+        </w:rPr>
+        <w:t>.</w:t>
+      </w:r>
+    </w:p>
+    <w:p>
+      <w:pPr>
+        <w:jc w:val="center"/>
+      </w:pPr>
+      <w:r>
+        <w:drawing>
+          <wp:inline xmlns:a="http://schemas.openxmlformats.org/drawingml/2006/main" xmlns:pic="http://schemas.openxmlformats.org/drawingml/2006/picture">
+            <wp:extent cx="5400000" cy="987805"/>
+            <wp:docPr id="6" name="Picture 6"/>
+            <wp:cNvGraphicFramePr>
+              <a:graphicFrameLocks noChangeAspect="1"/>
+            </wp:cNvGraphicFramePr>
+            <a:graphic>
+              <a:graphicData uri="http://schemas.openxmlformats.org/drawingml/2006/picture">
+                <pic:pic>
+                  <pic:nvPicPr>
+                    <pic:cNvPr id="0" name="01_cluster_context.png"/>
+                    <pic:cNvPicPr/>
+                  </pic:nvPicPr>
+                  <pic:blipFill>
+                    <a:blip r:embed="rId15"/>
+                    <a:stretch>
+                      <a:fillRect/>
+                    </a:stretch>
+                  </pic:blipFill>
+                  <pic:spPr>
+                    <a:xfrm>
+                      <a:off x="0" y="0"/>
+                      <a:ext cx="5400000" cy="987805"/>
+                    </a:xfrm>
+                    <a:prstGeom prst="rect"/>
+                  </pic:spPr>
+                </pic:pic>
+              </a:graphicData>
+            </a:graphic>
+          </wp:inline>
+        </w:drawing>
+      </w:r>
+    </w:p>
+    <w:p>
+      <w:pPr>
+        <w:spacing w:after="160"/>
+        <w:jc w:val="center"/>
+      </w:pPr>
+      <w:r>
+        <w:rPr>
+          <w:rFonts w:ascii="Calibri" w:hAnsi="Calibri"/>
+          <w:i/>
+          <w:color w:val="555555"/>
+          <w:sz w:val="18"/>
+        </w:rPr>
+        <w:t>Figure 6 — kubectl get nodes showing the two-node cluster (controlplane + node01) both Ready.</w:t>
+      </w:r>
+    </w:p>
+    <w:p>
+      <w:pPr>
+        <w:jc w:val="center"/>
+      </w:pPr>
+      <w:r>
+        <w:drawing>
+          <wp:inline xmlns:a="http://schemas.openxmlformats.org/drawingml/2006/main" xmlns:pic="http://schemas.openxmlformats.org/drawingml/2006/picture">
+            <wp:extent cx="5400000" cy="451186"/>
+            <wp:docPr id="7" name="Picture 7"/>
+            <wp:cNvGraphicFramePr>
+              <a:graphicFrameLocks noChangeAspect="1"/>
+            </wp:cNvGraphicFramePr>
+            <a:graphic>
+              <a:graphicData uri="http://schemas.openxmlformats.org/drawingml/2006/picture">
+                <pic:pic>
+                  <pic:nvPicPr>
+                    <pic:cNvPr id="0" name="02_docker_image.png"/>
+                    <pic:cNvPicPr/>
+                  </pic:nvPicPr>
+                  <pic:blipFill>
+                    <a:blip r:embed="rId16"/>
+                    <a:stretch>
+                      <a:fillRect/>
+                    </a:stretch>
+                  </pic:blipFill>
+                  <pic:spPr>
+                    <a:xfrm>
+                      <a:off x="0" y="0"/>
+                      <a:ext cx="5400000" cy="451186"/>
+                    </a:xfrm>
+                    <a:prstGeom prst="rect"/>
+                  </pic:spPr>
+                </pic:pic>
+              </a:graphicData>
+            </a:graphic>
+          </wp:inline>
+        </w:drawing>
+      </w:r>
+    </w:p>
+    <w:p>
+      <w:pPr>
+        <w:spacing w:after="160"/>
+        <w:jc w:val="center"/>
+      </w:pPr>
+      <w:r>
+        <w:rPr>
+          <w:rFonts w:ascii="Calibri" w:hAnsi="Calibri"/>
+          <w:i/>
+          <w:color w:val="555555"/>
+          <w:sz w:val="18"/>
+        </w:rPr>
+        <w:t>Figure 7 — docker images heart-disease-api: image produced by the multi-stage build.</w:t>
+      </w:r>
+    </w:p>
+    <w:p>
+      <w:pPr>
+        <w:jc w:val="center"/>
+      </w:pPr>
+      <w:r>
+        <w:drawing>
+          <wp:inline xmlns:a="http://schemas.openxmlformats.org/drawingml/2006/main" xmlns:pic="http://schemas.openxmlformats.org/drawingml/2006/picture">
+            <wp:extent cx="5400000" cy="474186"/>
+            <wp:docPr id="8" name="Picture 8"/>
+            <wp:cNvGraphicFramePr>
+              <a:graphicFrameLocks noChangeAspect="1"/>
+            </wp:cNvGraphicFramePr>
+            <a:graphic>
+              <a:graphicData uri="http://schemas.openxmlformats.org/drawingml/2006/picture">
+                <pic:pic>
+                  <pic:nvPicPr>
+                    <pic:cNvPr id="0" name="03_pods_running.png"/>
+                    <pic:cNvPicPr/>
+                  </pic:nvPicPr>
+                  <pic:blipFill>
+                    <a:blip r:embed="rId17"/>
+                    <a:stretch>
+                      <a:fillRect/>
+                    </a:stretch>
+                  </pic:blipFill>
+                  <pic:spPr>
+                    <a:xfrm>
+                      <a:off x="0" y="0"/>
+                      <a:ext cx="5400000" cy="474186"/>
+                    </a:xfrm>
+                    <a:prstGeom prst="rect"/>
+                  </pic:spPr>
+                </pic:pic>
+              </a:graphicData>
+            </a:graphic>
+          </wp:inline>
+        </w:drawing>
+      </w:r>
+    </w:p>
+    <w:p>
+      <w:pPr>
+        <w:spacing w:after="160"/>
+        <w:jc w:val="center"/>
+      </w:pPr>
+      <w:r>
+        <w:rPr>
+          <w:rFonts w:ascii="Calibri" w:hAnsi="Calibri"/>
+          <w:i/>
+          <w:color w:val="555555"/>
+          <w:sz w:val="18"/>
+        </w:rPr>
+        <w:t>Figure 8 — kubectl -n heart-disease get pods -o wide: both replicas 1/1 Running across the two nodes.</w:t>
+      </w:r>
+    </w:p>
+    <w:p>
+      <w:pPr>
+        <w:jc w:val="center"/>
+      </w:pPr>
+      <w:r>
+        <w:drawing>
+          <wp:inline xmlns:a="http://schemas.openxmlformats.org/drawingml/2006/main" xmlns:pic="http://schemas.openxmlformats.org/drawingml/2006/picture">
+            <wp:extent cx="5400000" cy="3666718"/>
+            <wp:docPr id="9" name="Picture 9"/>
+            <wp:cNvGraphicFramePr>
+              <a:graphicFrameLocks noChangeAspect="1"/>
+            </wp:cNvGraphicFramePr>
+            <a:graphic>
+              <a:graphicData uri="http://schemas.openxmlformats.org/drawingml/2006/picture">
+                <pic:pic>
+                  <pic:nvPicPr>
+                    <pic:cNvPr id="0" name="04_deployment_describe.png"/>
+                    <pic:cNvPicPr/>
+                  </pic:nvPicPr>
+                  <pic:blipFill>
+                    <a:blip r:embed="rId18"/>
+                    <a:stretch>
+                      <a:fillRect/>
+                    </a:stretch>
+                  </pic:blipFill>
+                  <pic:spPr>
+                    <a:xfrm>
+                      <a:off x="0" y="0"/>
+                      <a:ext cx="5400000" cy="3666718"/>
+                    </a:xfrm>
+                    <a:prstGeom prst="rect"/>
+                  </pic:spPr>
+                </pic:pic>
+              </a:graphicData>
+            </a:graphic>
+          </wp:inline>
+        </w:drawing>
+      </w:r>
+    </w:p>
+    <w:p>
+      <w:pPr>
+        <w:spacing w:after="160"/>
+        <w:jc w:val="center"/>
+      </w:pPr>
+      <w:r>
+        <w:rPr>
+          <w:rFonts w:ascii="Calibri" w:hAnsi="Calibri"/>
+          <w:i/>
+          <w:color w:val="555555"/>
+          <w:sz w:val="18"/>
+        </w:rPr>
+        <w:t>Figure 9 — kubectl describe deployment: RollingUpdate strategy, 2/2 available, probes wired.</w:t>
+      </w:r>
+    </w:p>
+    <w:p>
+      <w:pPr>
+        <w:jc w:val="center"/>
+      </w:pPr>
+      <w:r>
+        <w:drawing>
+          <wp:inline xmlns:a="http://schemas.openxmlformats.org/drawingml/2006/main" xmlns:pic="http://schemas.openxmlformats.org/drawingml/2006/picture">
+            <wp:extent cx="5400000" cy="619738"/>
+            <wp:docPr id="10" name="Picture 10"/>
+            <wp:cNvGraphicFramePr>
+              <a:graphicFrameLocks noChangeAspect="1"/>
+            </wp:cNvGraphicFramePr>
+            <a:graphic>
+              <a:graphicData uri="http://schemas.openxmlformats.org/drawingml/2006/picture">
+                <pic:pic>
+                  <pic:nvPicPr>
+                    <pic:cNvPr id="0" name="05_service_nodeport.png"/>
+                    <pic:cNvPicPr/>
+                  </pic:nvPicPr>
+                  <pic:blipFill>
+                    <a:blip r:embed="rId19"/>
+                    <a:stretch>
+                      <a:fillRect/>
+                    </a:stretch>
+                  </pic:blipFill>
+                  <pic:spPr>
+                    <a:xfrm>
+                      <a:off x="0" y="0"/>
+                      <a:ext cx="5400000" cy="619738"/>
+                    </a:xfrm>
+                    <a:prstGeom prst="rect"/>
+                  </pic:spPr>
+                </pic:pic>
+              </a:graphicData>
+            </a:graphic>
+          </wp:inline>
+        </w:drawing>
+      </w:r>
+    </w:p>
+    <w:p>
+      <w:pPr>
+        <w:spacing w:after="160"/>
+        <w:jc w:val="center"/>
+      </w:pPr>
+      <w:r>
+        <w:rPr>
+          <w:rFonts w:ascii="Calibri" w:hAnsi="Calibri"/>
+          <w:i/>
+          <w:color w:val="555555"/>
+          <w:sz w:val="18"/>
+        </w:rPr>
+        <w:t>Figure 10 — kubectl get svc: NodePort service exposed for external traffic.</w:t>
+      </w:r>
+    </w:p>
+    <w:p>
+      <w:pPr>
+        <w:jc w:val="center"/>
+      </w:pPr>
+      <w:r>
+        <w:drawing>
+          <wp:inline xmlns:a="http://schemas.openxmlformats.org/drawingml/2006/main" xmlns:pic="http://schemas.openxmlformats.org/drawingml/2006/picture">
+            <wp:extent cx="5400000" cy="413665"/>
+            <wp:docPr id="11" name="Picture 11"/>
+            <wp:cNvGraphicFramePr>
+              <a:graphicFrameLocks noChangeAspect="1"/>
+            </wp:cNvGraphicFramePr>
+            <a:graphic>
+              <a:graphicData uri="http://schemas.openxmlformats.org/drawingml/2006/picture">
+                <pic:pic>
+                  <pic:nvPicPr>
+                    <pic:cNvPr id="0" name="06_hpa.png"/>
+                    <pic:cNvPicPr/>
+                  </pic:nvPicPr>
+                  <pic:blipFill>
+                    <a:blip r:embed="rId20"/>
+                    <a:stretch>
+                      <a:fillRect/>
+                    </a:stretch>
+                  </pic:blipFill>
+                  <pic:spPr>
+                    <a:xfrm>
+                      <a:off x="0" y="0"/>
+                      <a:ext cx="5400000" cy="413665"/>
+                    </a:xfrm>
+                    <a:prstGeom prst="rect"/>
+                  </pic:spPr>
+                </pic:pic>
+              </a:graphicData>
+            </a:graphic>
+          </wp:inline>
+        </w:drawing>
+      </w:r>
+    </w:p>
+    <w:p>
+      <w:pPr>
+        <w:spacing w:after="160"/>
+        <w:jc w:val="center"/>
+      </w:pPr>
+      <w:r>
+        <w:rPr>
+          <w:rFonts w:ascii="Calibri" w:hAnsi="Calibri"/>
+          <w:i/>
+          <w:color w:val="555555"/>
+          <w:sz w:val="18"/>
+        </w:rPr>
+        <w:t>Figure 11 — kubectl get hpa: active HPA (2-5 replicas, 70 % CPU target) with live metrics.</w:t>
+      </w:r>
+    </w:p>
+    <w:p>
+      <w:pPr>
+        <w:jc w:val="center"/>
+      </w:pPr>
+      <w:r>
+        <w:drawing>
+          <wp:inline xmlns:a="http://schemas.openxmlformats.org/drawingml/2006/main" xmlns:pic="http://schemas.openxmlformats.org/drawingml/2006/picture">
+            <wp:extent cx="5400000" cy="3777149"/>
+            <wp:docPr id="12" name="Picture 12"/>
+            <wp:cNvGraphicFramePr>
+              <a:graphicFrameLocks noChangeAspect="1"/>
+            </wp:cNvGraphicFramePr>
+            <a:graphic>
+              <a:graphicData uri="http://schemas.openxmlformats.org/drawingml/2006/picture">
+                <pic:pic>
+                  <pic:nvPicPr>
+                    <pic:cNvPr id="0" name="07_curl_health_predict.png"/>
+                    <pic:cNvPicPr/>
+                  </pic:nvPicPr>
+                  <pic:blipFill>
+                    <a:blip r:embed="rId21"/>
+                    <a:stretch>
+                      <a:fillRect/>
+                    </a:stretch>
+                  </pic:blipFill>
+                  <pic:spPr>
+                    <a:xfrm>
+                      <a:off x="0" y="0"/>
+                      <a:ext cx="5400000" cy="3777149"/>
+                    </a:xfrm>
+                    <a:prstGeom prst="rect"/>
+                  </pic:spPr>
+                </pic:pic>
+              </a:graphicData>
+            </a:graphic>
+          </wp:inline>
+        </w:drawing>
+      </w:r>
+    </w:p>
+    <w:p>
+      <w:pPr>
+        <w:spacing w:after="160"/>
+        <w:jc w:val="center"/>
+      </w:pPr>
+      <w:r>
+        <w:rPr>
+          <w:rFonts w:ascii="Calibri" w:hAnsi="Calibri"/>
+          <w:i/>
+          <w:color w:val="555555"/>
+          <w:sz w:val="18"/>
+        </w:rPr>
+        <w:t>Figure 12 — Live curl calls: /health and /predict returning valid JSON.</w:t>
+      </w:r>
+    </w:p>
+    <w:p>
+      <w:r>
+        <w:br w:type="page"/>
+      </w:r>
+    </w:p>
+    <w:p>
+      <w:pPr>
+        <w:spacing w:before="240" w:after="120"/>
+      </w:pPr>
+      <w:r>
+        <w:rPr>
+          <w:rFonts w:ascii="Calibri" w:hAnsi="Calibri"/>
+          <w:b/>
+          <w:color w:val="1F4E79"/>
+          <w:sz w:val="30"/>
+        </w:rPr>
+        <w:t>14. End-to-End Architecture</w:t>
+      </w:r>
+    </w:p>
+    <w:p>
+      <w:pPr>
+        <w:spacing w:after="80"/>
+        <w:jc w:val="both"/>
+      </w:pPr>
+      <w:r>
+        <w:rPr>
+          <w:rFonts w:ascii="Calibri" w:hAnsi="Calibri"/>
+          <w:sz w:val="21"/>
+        </w:rPr>
+        <w:t>The diagram below summarises how the components fit together across the development, CI, and runtime planes.</w:t>
+      </w:r>
+    </w:p>
+    <w:p>
+      <w:pPr>
+        <w:spacing w:after="80"/>
+        <w:jc w:val="both"/>
+      </w:pPr>
+      <w:r>
+        <w:rPr>
+          <w:rFonts w:ascii="Consolas" w:hAnsi="Consolas"/>
+          <w:sz w:val="21"/>
+        </w:rPr>
+        <w:t>┌────────────────────── DEVELOPMENT ──────────────────────┐</w:t>
+      </w:r>
+      <w:r>
+        <w:br/>
+      </w:r>
+      <w:r>
+        <w:rPr>
+          <w:rFonts w:ascii="Consolas" w:hAnsi="Consolas"/>
+          <w:sz w:val="21"/>
+        </w:rPr>
+        <w:t>│  notebooks/01_eda.ipynb  ──► src/{data_loader,           │</w:t>
+      </w:r>
+      <w:r>
+        <w:br/>
+      </w:r>
+      <w:r>
+        <w:rPr>
+          <w:rFonts w:ascii="Consolas" w:hAnsi="Consolas"/>
+          <w:sz w:val="21"/>
+        </w:rPr>
+        <w:t>│                                preprocess, train,        │</w:t>
+      </w:r>
+      <w:r>
+        <w:br/>
+      </w:r>
+      <w:r>
+        <w:rPr>
+          <w:rFonts w:ascii="Consolas" w:hAnsi="Consolas"/>
+          <w:sz w:val="21"/>
+        </w:rPr>
+        <w:t>│                                evaluate, predict}.py     │</w:t>
+      </w:r>
+      <w:r>
+        <w:br/>
+      </w:r>
+      <w:r>
+        <w:rPr>
+          <w:rFonts w:ascii="Consolas" w:hAnsi="Consolas"/>
+          <w:sz w:val="21"/>
+        </w:rPr>
+        <w:t>│        │                              │                  │</w:t>
+      </w:r>
+      <w:r>
+        <w:br/>
+      </w:r>
+      <w:r>
+        <w:rPr>
+          <w:rFonts w:ascii="Consolas" w:hAnsi="Consolas"/>
+          <w:sz w:val="21"/>
+        </w:rPr>
+        <w:t>│        ▼                              ▼                  │</w:t>
+      </w:r>
+      <w:r>
+        <w:br/>
+      </w:r>
+      <w:r>
+        <w:rPr>
+          <w:rFonts w:ascii="Consolas" w:hAnsi="Consolas"/>
+          <w:sz w:val="21"/>
+        </w:rPr>
+        <w:t>│  reports/figures/*.png        models/model.pkl  +        │</w:t>
+      </w:r>
+      <w:r>
+        <w:br/>
+      </w:r>
+      <w:r>
+        <w:rPr>
+          <w:rFonts w:ascii="Consolas" w:hAnsi="Consolas"/>
+          <w:sz w:val="21"/>
+        </w:rPr>
+        <w:t>│                               mlruns/* (MLflow store)    │</w:t>
+      </w:r>
+      <w:r>
+        <w:br/>
+      </w:r>
+      <w:r>
+        <w:rPr>
+          <w:rFonts w:ascii="Consolas" w:hAnsi="Consolas"/>
+          <w:sz w:val="21"/>
+        </w:rPr>
+        <w:t>└──────────────────┬──────────────────────────────────────┘</w:t>
+      </w:r>
+      <w:r>
+        <w:br/>
+      </w:r>
+      <w:r>
+        <w:rPr>
+          <w:rFonts w:ascii="Consolas" w:hAnsi="Consolas"/>
+          <w:sz w:val="21"/>
+        </w:rPr>
+        <w:t xml:space="preserve">                   │  git push</w:t>
+      </w:r>
+      <w:r>
+        <w:br/>
+      </w:r>
+      <w:r>
+        <w:rPr>
+          <w:rFonts w:ascii="Consolas" w:hAnsi="Consolas"/>
+          <w:sz w:val="21"/>
+        </w:rPr>
+        <w:t xml:space="preserve">                   ▼</w:t>
+      </w:r>
+      <w:r>
+        <w:br/>
+      </w:r>
+      <w:r>
+        <w:rPr>
+          <w:rFonts w:ascii="Consolas" w:hAnsi="Consolas"/>
+          <w:sz w:val="21"/>
+        </w:rPr>
+        <w:t>┌──────────────────────── CI / CD ─────────────────────────┐</w:t>
+      </w:r>
+      <w:r>
+        <w:br/>
+      </w:r>
+      <w:r>
+        <w:rPr>
+          <w:rFonts w:ascii="Consolas" w:hAnsi="Consolas"/>
+          <w:sz w:val="21"/>
+        </w:rPr>
+        <w:t>│  GitHub Actions  ──► ruff lint ──► pytest (35) ──►       │</w:t>
+      </w:r>
+      <w:r>
+        <w:br/>
+      </w:r>
+      <w:r>
+        <w:rPr>
+          <w:rFonts w:ascii="Consolas" w:hAnsi="Consolas"/>
+          <w:sz w:val="21"/>
+        </w:rPr>
+        <w:t>│   smoke train    ──► docker build (multi-stage)          │</w:t>
+      </w:r>
+      <w:r>
+        <w:br/>
+      </w:r>
+      <w:r>
+        <w:rPr>
+          <w:rFonts w:ascii="Consolas" w:hAnsi="Consolas"/>
+          <w:sz w:val="21"/>
+        </w:rPr>
+        <w:t>│  artefacts: model.pkl + metrics.json + image             │</w:t>
+      </w:r>
+      <w:r>
+        <w:br/>
+      </w:r>
+      <w:r>
+        <w:rPr>
+          <w:rFonts w:ascii="Consolas" w:hAnsi="Consolas"/>
+          <w:sz w:val="21"/>
+        </w:rPr>
+        <w:t>└──────────────────┬──────────────────────────────────────┘</w:t>
+      </w:r>
+      <w:r>
+        <w:br/>
+      </w:r>
+      <w:r>
+        <w:rPr>
+          <w:rFonts w:ascii="Consolas" w:hAnsi="Consolas"/>
+          <w:sz w:val="21"/>
+        </w:rPr>
+        <w:t xml:space="preserve">                   │  docker push (out of scope)</w:t>
+      </w:r>
+      <w:r>
+        <w:br/>
+      </w:r>
+      <w:r>
+        <w:rPr>
+          <w:rFonts w:ascii="Consolas" w:hAnsi="Consolas"/>
+          <w:sz w:val="21"/>
+        </w:rPr>
+        <w:t xml:space="preserve">                   ▼</w:t>
+      </w:r>
+      <w:r>
+        <w:br/>
+      </w:r>
+      <w:r>
+        <w:rPr>
+          <w:rFonts w:ascii="Consolas" w:hAnsi="Consolas"/>
+          <w:sz w:val="21"/>
+        </w:rPr>
+        <w:t>┌──────────────────────── RUNTIME ─────────────────────────┐</w:t>
+      </w:r>
+      <w:r>
+        <w:br/>
+      </w:r>
+      <w:r>
+        <w:rPr>
+          <w:rFonts w:ascii="Consolas" w:hAnsi="Consolas"/>
+          <w:sz w:val="21"/>
+        </w:rPr>
+        <w:t>│              ┌─────────── Kubernetes ──────────┐         │</w:t>
+      </w:r>
+      <w:r>
+        <w:br/>
+      </w:r>
+      <w:r>
+        <w:rPr>
+          <w:rFonts w:ascii="Consolas" w:hAnsi="Consolas"/>
+          <w:sz w:val="21"/>
+        </w:rPr>
+        <w:t>│  client ──► │ LB Service ──► Pod (FastAPI)     │         │</w:t>
+      </w:r>
+      <w:r>
+        <w:br/>
+      </w:r>
+      <w:r>
+        <w:rPr>
+          <w:rFonts w:ascii="Consolas" w:hAnsi="Consolas"/>
+          <w:sz w:val="21"/>
+        </w:rPr>
+        <w:t>│              │                 │ /metrics      │         │</w:t>
+      </w:r>
+      <w:r>
+        <w:br/>
+      </w:r>
+      <w:r>
+        <w:rPr>
+          <w:rFonts w:ascii="Consolas" w:hAnsi="Consolas"/>
+          <w:sz w:val="21"/>
+        </w:rPr>
+        <w:t>│              │  HPA(2-5)       ▼               │         │</w:t>
+      </w:r>
+      <w:r>
+        <w:br/>
+      </w:r>
+      <w:r>
+        <w:rPr>
+          <w:rFonts w:ascii="Consolas" w:hAnsi="Consolas"/>
+          <w:sz w:val="21"/>
+        </w:rPr>
+        <w:t>│              │            Prometheus ──► Grafana│        │</w:t>
+      </w:r>
+      <w:r>
+        <w:br/>
+      </w:r>
+      <w:r>
+        <w:rPr>
+          <w:rFonts w:ascii="Consolas" w:hAnsi="Consolas"/>
+          <w:sz w:val="21"/>
+        </w:rPr>
+        <w:t>│              └──────────────────────────────────┘        │</w:t>
+      </w:r>
+      <w:r>
+        <w:br/>
+      </w:r>
+      <w:r>
+        <w:rPr>
+          <w:rFonts w:ascii="Consolas" w:hAnsi="Consolas"/>
+          <w:sz w:val="21"/>
+        </w:rPr>
+        <w:t>│   stdout JSON logs ──► (Loki / ELK / CloudWatch in prod) │</w:t>
+      </w:r>
+      <w:r>
+        <w:br/>
+      </w:r>
+      <w:r>
+        <w:rPr>
+          <w:rFonts w:ascii="Consolas" w:hAnsi="Consolas"/>
+          <w:sz w:val="21"/>
+        </w:rPr>
+        <w:t>└──────────────────────────────────────────────────────────┘</w:t>
+      </w:r>
+    </w:p>
+    <w:p>
+      <w:pPr>
+        <w:spacing w:after="80"/>
+        <w:jc w:val="both"/>
+      </w:pPr>
+      <w:r>
+        <w:rPr>
+          <w:rFonts w:ascii="Calibri" w:hAnsi="Calibri"/>
+          <w:sz w:val="21"/>
+        </w:rPr>
+        <w:t xml:space="preserve">Each plane is independently testable: the development plane via the notebook + </w:t>
+      </w:r>
+      <w:r>
+        <w:rPr>
+          <w:rFonts w:ascii="Consolas" w:hAnsi="Consolas"/>
+          <w:sz w:val="21"/>
+        </w:rPr>
+        <w:t>pytest</w:t>
+      </w:r>
+      <w:r>
+        <w:rPr>
+          <w:rFonts w:ascii="Calibri" w:hAnsi="Calibri"/>
+          <w:sz w:val="21"/>
+        </w:rPr>
+        <w:t xml:space="preserve">, the CI plane via the GitHub Actions workflow, and the runtime plane via the local </w:t>
+      </w:r>
+      <w:r>
+        <w:rPr>
+          <w:rFonts w:ascii="Consolas" w:hAnsi="Consolas"/>
+          <w:sz w:val="21"/>
+        </w:rPr>
+        <w:t>docker compose</w:t>
+      </w:r>
+      <w:r>
+        <w:rPr>
+          <w:rFonts w:ascii="Calibri" w:hAnsi="Calibri"/>
+          <w:sz w:val="21"/>
+        </w:rPr>
+        <w:t xml:space="preserve"> stack that mirrors the in-cluster topology. This separation is what makes day-2 operations tractable — a failed deploy can be reproduced locally with the exact same image.</w:t>
+      </w:r>
+    </w:p>
+    <w:p>
+      <w:r>
+        <w:br w:type="page"/>
+      </w:r>
+    </w:p>
+    <w:p>
+      <w:pPr>
+        <w:spacing w:before="240" w:after="120"/>
+      </w:pPr>
+      <w:r>
+        <w:rPr>
+          <w:rFonts w:ascii="Calibri" w:hAnsi="Calibri"/>
+          <w:b/>
+          <w:color w:val="1F4E79"/>
+          <w:sz w:val="30"/>
+        </w:rPr>
+        <w:t>13. Conclusion &amp; Future Work</w:t>
+      </w:r>
+    </w:p>
+    <w:p>
+      <w:pPr>
+        <w:spacing w:after="80"/>
+        <w:jc w:val="both"/>
+      </w:pPr>
+      <w:r>
+        <w:rPr>
+          <w:rFonts w:ascii="Calibri" w:hAnsi="Calibri"/>
+          <w:sz w:val="21"/>
+        </w:rPr>
+        <w:t>The pipeline meets every functional requirement of the assignment brief and ships with the operational guard-rails expected of a production system: deterministic preprocessing, tracked experiments, automated tests on every push, a slim non-root container, declarative Kubernetes deployment with autoscaling, and a working metrics + logging stack. On the held-out test set the selected model achieves ROC-AUC = 0.959, F1 = 0.862, recall = 0.893 — clinically reasonable given the dataset size.</w:t>
+      </w:r>
+    </w:p>
+    <w:p>
+      <w:pPr>
+        <w:spacing w:after="80"/>
+        <w:jc w:val="both"/>
+      </w:pPr>
+      <w:r>
+        <w:rPr>
+          <w:rFonts w:ascii="Calibri" w:hAnsi="Calibri"/>
+          <w:i/>
+          <w:sz w:val="21"/>
+        </w:rPr>
+        <w:t>Note on figures:</w:t>
+      </w:r>
+      <w:r>
+        <w:rPr>
+          <w:rFonts w:ascii="Calibri" w:hAnsi="Calibri"/>
+          <w:sz w:val="21"/>
+        </w:rPr>
+        <w:t xml:space="preserve"> Figures 3-5 (MLflow, Swagger, Grafana) are programmatically rendered reproductions of the respective UIs, produced by </w:t>
+      </w:r>
+      <w:r>
+        <w:rPr>
+          <w:rFonts w:ascii="Consolas" w:hAnsi="Consolas"/>
+          <w:sz w:val="21"/>
+        </w:rPr>
+        <w:t>scripts/generate_screenshots.py</w:t>
+      </w:r>
+      <w:r>
+        <w:rPr>
+          <w:rFonts w:ascii="Calibri" w:hAnsi="Calibri"/>
+          <w:sz w:val="21"/>
+        </w:rPr>
+        <w:t xml:space="preserve"> from real metrics in </w:t>
+      </w:r>
+      <w:r>
+        <w:rPr>
+          <w:rFonts w:ascii="Consolas" w:hAnsi="Consolas"/>
+          <w:sz w:val="21"/>
+        </w:rPr>
+        <w:t>reports/metrics.json</w:t>
+      </w:r>
+      <w:r>
+        <w:rPr>
+          <w:rFonts w:ascii="Calibri" w:hAnsi="Calibri"/>
+          <w:sz w:val="21"/>
+        </w:rPr>
+        <w:t xml:space="preserve"> and the panel layout in </w:t>
+      </w:r>
+      <w:r>
+        <w:rPr>
+          <w:rFonts w:ascii="Consolas" w:hAnsi="Consolas"/>
+          <w:sz w:val="21"/>
+        </w:rPr>
+        <w:t>monitoring/grafana/dashboards/heart-disease-api.json</w:t>
+      </w:r>
+      <w:r>
+        <w:rPr>
+          <w:rFonts w:ascii="Calibri" w:hAnsi="Calibri"/>
+          <w:sz w:val="21"/>
+        </w:rPr>
+        <w:t xml:space="preserve">. Figures 6-12 in §12 are </w:t>
+      </w:r>
+      <w:r>
+        <w:rPr>
+          <w:rFonts w:ascii="Calibri" w:hAnsi="Calibri"/>
+          <w:b/>
+          <w:sz w:val="21"/>
+        </w:rPr>
+        <w:t>genuine screenshots</w:t>
+      </w:r>
+      <w:r>
+        <w:rPr>
+          <w:rFonts w:ascii="Calibri" w:hAnsi="Calibri"/>
+          <w:sz w:val="21"/>
+        </w:rPr>
+        <w:t xml:space="preserve"> captured from the live two-node Kubernetes cluster on Killercoda.</w:t>
+      </w:r>
+    </w:p>
+    <w:p>
+      <w:pPr>
+        <w:spacing w:before="160" w:after="60"/>
+      </w:pPr>
+      <w:r>
+        <w:rPr>
+          <w:rFonts w:ascii="Calibri" w:hAnsi="Calibri"/>
+          <w:b/>
+          <w:color w:val="C0392B"/>
+          <w:sz w:val="23"/>
+        </w:rPr>
+        <w:t>Suggested next steps</w:t>
       </w:r>
     </w:p>
     <w:p>
@@ -4822,9 +5137,32 @@
       <w:r>
         <w:rPr>
           <w:rFonts w:ascii="Calibri" w:hAnsi="Calibri"/>
-          <w:sz w:val="21"/>
-        </w:rPr>
-        <w:t>Prometheus best-practice metric naming — https://prometheus.io/docs/practices/naming/</w:t>
+          <w:b/>
+          <w:sz w:val="21"/>
+        </w:rPr>
+        <w:t>Model registry:</w:t>
+      </w:r>
+      <w:r>
+        <w:rPr>
+          <w:rFonts w:ascii="Calibri" w:hAnsi="Calibri"/>
+          <w:sz w:val="21"/>
+        </w:rPr>
+        <w:t xml:space="preserve"> promote the MLflow model to a </w:t>
+      </w:r>
+      <w:r>
+        <w:rPr>
+          <w:rFonts w:ascii="Calibri" w:hAnsi="Calibri"/>
+          <w:i/>
+          <w:sz w:val="21"/>
+        </w:rPr>
+        <w:t>Production</w:t>
+      </w:r>
+      <w:r>
+        <w:rPr>
+          <w:rFonts w:ascii="Calibri" w:hAnsi="Calibri"/>
+          <w:sz w:val="21"/>
+        </w:rPr>
+        <w:t xml:space="preserve"> stage and have the API resolve the URI at boot instead of loading a local pickle.</w:t>
       </w:r>
     </w:p>
     <w:p>
@@ -4839,9 +5177,1300 @@
       <w:r>
         <w:rPr>
           <w:rFonts w:ascii="Calibri" w:hAnsi="Calibri"/>
+          <w:b/>
+          <w:sz w:val="21"/>
+        </w:rPr>
+        <w:t>Drift detection:</w:t>
+      </w:r>
+      <w:r>
+        <w:rPr>
+          <w:rFonts w:ascii="Calibri" w:hAnsi="Calibri"/>
+          <w:sz w:val="21"/>
+        </w:rPr>
+        <w:t xml:space="preserve"> wire </w:t>
+      </w:r>
+      <w:r>
+        <w:rPr>
+          <w:rFonts w:ascii="Calibri" w:hAnsi="Calibri"/>
+          <w:i/>
+          <w:sz w:val="21"/>
+        </w:rPr>
+        <w:t>evidently</w:t>
+      </w:r>
+      <w:r>
+        <w:rPr>
+          <w:rFonts w:ascii="Calibri" w:hAnsi="Calibri"/>
+          <w:sz w:val="21"/>
+        </w:rPr>
+        <w:t xml:space="preserve"> or </w:t>
+      </w:r>
+      <w:r>
+        <w:rPr>
+          <w:rFonts w:ascii="Calibri" w:hAnsi="Calibri"/>
+          <w:i/>
+          <w:sz w:val="21"/>
+        </w:rPr>
+        <w:t>WhyLabs</w:t>
+      </w:r>
+      <w:r>
+        <w:rPr>
+          <w:rFonts w:ascii="Calibri" w:hAnsi="Calibri"/>
+          <w:sz w:val="21"/>
+        </w:rPr>
+        <w:t xml:space="preserve"> into a sidecar that consumes the JSON logs and alerts on input/score drift.</w:t>
+      </w:r>
+    </w:p>
+    <w:p>
+      <w:pPr>
+        <w:spacing w:after="40"/>
+        <w:ind w:left="340"/>
+        <w:numPr>
+          <w:ilvl w:val="0"/>
+          <w:numId w:val="1"/>
+        </w:numPr>
+      </w:pPr>
+      <w:r>
+        <w:rPr>
+          <w:rFonts w:ascii="Calibri" w:hAnsi="Calibri"/>
+          <w:b/>
+          <w:sz w:val="21"/>
+        </w:rPr>
+        <w:t>Calibration &amp; explainability:</w:t>
+      </w:r>
+      <w:r>
+        <w:rPr>
+          <w:rFonts w:ascii="Calibri" w:hAnsi="Calibri"/>
+          <w:sz w:val="21"/>
+        </w:rPr>
+        <w:t xml:space="preserve"> add Platt scaling / SHAP summary plots so clinicians get probability estimates they can trust and feature-level reasons for each prediction.</w:t>
+      </w:r>
+    </w:p>
+    <w:p>
+      <w:pPr>
+        <w:spacing w:after="40"/>
+        <w:ind w:left="340"/>
+        <w:numPr>
+          <w:ilvl w:val="0"/>
+          <w:numId w:val="1"/>
+        </w:numPr>
+      </w:pPr>
+      <w:r>
+        <w:rPr>
+          <w:rFonts w:ascii="Calibri" w:hAnsi="Calibri"/>
+          <w:b/>
+          <w:sz w:val="21"/>
+        </w:rPr>
+        <w:t>GitOps rollout:</w:t>
+      </w:r>
+      <w:r>
+        <w:rPr>
+          <w:rFonts w:ascii="Calibri" w:hAnsi="Calibri"/>
+          <w:sz w:val="21"/>
+        </w:rPr>
+        <w:t xml:space="preserve"> manage the K8s manifests with ArgoCD or FluxCD so production state is reconciled from Git.</w:t>
+      </w:r>
+    </w:p>
+    <w:p>
+      <w:pPr>
+        <w:spacing w:before="240" w:after="120"/>
+      </w:pPr>
+      <w:r>
+        <w:rPr>
+          <w:rFonts w:ascii="Calibri" w:hAnsi="Calibri"/>
+          <w:b/>
+          <w:color w:val="1F4E79"/>
+          <w:sz w:val="30"/>
+        </w:rPr>
+        <w:t>Appendix A — Reproducing the Results</w:t>
+      </w:r>
+    </w:p>
+    <w:p>
+      <w:pPr>
+        <w:spacing w:after="80"/>
+        <w:jc w:val="both"/>
+      </w:pPr>
+      <w:r>
+        <w:rPr>
+          <w:rFonts w:ascii="Consolas" w:hAnsi="Consolas"/>
+          <w:sz w:val="21"/>
+        </w:rPr>
+        <w:t># 1. Clone and create a virtual env</w:t>
+      </w:r>
+      <w:r>
+        <w:br/>
+      </w:r>
+      <w:r>
+        <w:rPr>
+          <w:rFonts w:ascii="Consolas" w:hAnsi="Consolas"/>
+          <w:sz w:val="21"/>
+        </w:rPr>
+        <w:t>git clone &lt;repo-url&gt;</w:t>
+      </w:r>
+      <w:r>
+        <w:br/>
+      </w:r>
+      <w:r>
+        <w:rPr>
+          <w:rFonts w:ascii="Consolas" w:hAnsi="Consolas"/>
+          <w:sz w:val="21"/>
+        </w:rPr>
+        <w:t>cd MLOps/Assignment1</w:t>
+      </w:r>
+      <w:r>
+        <w:br/>
+      </w:r>
+      <w:r>
+        <w:rPr>
+          <w:rFonts w:ascii="Consolas" w:hAnsi="Consolas"/>
+          <w:sz w:val="21"/>
+        </w:rPr>
+        <w:t>python -m venv .venv &amp;&amp; .venv\Scripts\Activate.ps1</w:t>
+      </w:r>
+      <w:r>
+        <w:br/>
+      </w:r>
+      <w:r>
+        <w:rPr>
+          <w:rFonts w:ascii="Consolas" w:hAnsi="Consolas"/>
+          <w:sz w:val="21"/>
+        </w:rPr>
+        <w:t>pip install -r requirements.txt</w:t>
+      </w:r>
+      <w:r>
+        <w:br/>
+      </w:r>
+      <w:r>
+        <w:br/>
+      </w:r>
+      <w:r>
+        <w:rPr>
+          <w:rFonts w:ascii="Consolas" w:hAnsi="Consolas"/>
+          <w:sz w:val="21"/>
+        </w:rPr>
+        <w:t># 2. Download data + train</w:t>
+      </w:r>
+      <w:r>
+        <w:br/>
+      </w:r>
+      <w:r>
+        <w:rPr>
+          <w:rFonts w:ascii="Consolas" w:hAnsi="Consolas"/>
+          <w:sz w:val="21"/>
+        </w:rPr>
+        <w:t>python scripts/download_data.py</w:t>
+      </w:r>
+      <w:r>
+        <w:br/>
+      </w:r>
+      <w:r>
+        <w:rPr>
+          <w:rFonts w:ascii="Consolas" w:hAnsi="Consolas"/>
+          <w:sz w:val="21"/>
+        </w:rPr>
+        <w:t>python -m src.train</w:t>
+      </w:r>
+      <w:r>
+        <w:br/>
+      </w:r>
+      <w:r>
+        <w:br/>
+      </w:r>
+      <w:r>
+        <w:rPr>
+          <w:rFonts w:ascii="Consolas" w:hAnsi="Consolas"/>
+          <w:sz w:val="21"/>
+        </w:rPr>
+        <w:t># 3. Lint + tests</w:t>
+      </w:r>
+      <w:r>
+        <w:br/>
+      </w:r>
+      <w:r>
+        <w:rPr>
+          <w:rFonts w:ascii="Consolas" w:hAnsi="Consolas"/>
+          <w:sz w:val="21"/>
+        </w:rPr>
+        <w:t>python -m ruff check src api tests scripts</w:t>
+      </w:r>
+      <w:r>
+        <w:br/>
+      </w:r>
+      <w:r>
+        <w:rPr>
+          <w:rFonts w:ascii="Consolas" w:hAnsi="Consolas"/>
+          <w:sz w:val="21"/>
+        </w:rPr>
+        <w:t>python -m pytest -q</w:t>
+      </w:r>
+      <w:r>
+        <w:br/>
+      </w:r>
+      <w:r>
+        <w:br/>
+      </w:r>
+      <w:r>
+        <w:rPr>
+          <w:rFonts w:ascii="Consolas" w:hAnsi="Consolas"/>
+          <w:sz w:val="21"/>
+        </w:rPr>
+        <w:t># 4. Run the API locally</w:t>
+      </w:r>
+      <w:r>
+        <w:br/>
+      </w:r>
+      <w:r>
+        <w:rPr>
+          <w:rFonts w:ascii="Consolas" w:hAnsi="Consolas"/>
+          <w:sz w:val="21"/>
+        </w:rPr>
+        <w:t>uvicorn api.app:app --reload</w:t>
+      </w:r>
+      <w:r>
+        <w:br/>
+      </w:r>
+      <w:r>
+        <w:br/>
+      </w:r>
+      <w:r>
+        <w:rPr>
+          <w:rFonts w:ascii="Consolas" w:hAnsi="Consolas"/>
+          <w:sz w:val="21"/>
+        </w:rPr>
+        <w:t># 5. Build &amp; run the container</w:t>
+      </w:r>
+      <w:r>
+        <w:br/>
+      </w:r>
+      <w:r>
+        <w:rPr>
+          <w:rFonts w:ascii="Consolas" w:hAnsi="Consolas"/>
+          <w:sz w:val="21"/>
+        </w:rPr>
+        <w:t>docker build -t heart-disease-api:latest -f docker/Dockerfile .</w:t>
+      </w:r>
+      <w:r>
+        <w:br/>
+      </w:r>
+      <w:r>
+        <w:rPr>
+          <w:rFonts w:ascii="Consolas" w:hAnsi="Consolas"/>
+          <w:sz w:val="21"/>
+        </w:rPr>
+        <w:t>docker run --rm -p 8000:8000 heart-disease-api:latest</w:t>
+      </w:r>
+      <w:r>
+        <w:br/>
+      </w:r>
+      <w:r>
+        <w:br/>
+      </w:r>
+      <w:r>
+        <w:rPr>
+          <w:rFonts w:ascii="Consolas" w:hAnsi="Consolas"/>
+          <w:sz w:val="21"/>
+        </w:rPr>
+        <w:t># 6. Local observability stack</w:t>
+      </w:r>
+      <w:r>
+        <w:br/>
+      </w:r>
+      <w:r>
+        <w:rPr>
+          <w:rFonts w:ascii="Consolas" w:hAnsi="Consolas"/>
+          <w:sz w:val="21"/>
+        </w:rPr>
+        <w:t>docker compose -f monitoring/docker-compose.yml up --build</w:t>
+      </w:r>
+      <w:r>
+        <w:br/>
+      </w:r>
+      <w:r>
+        <w:br/>
+      </w:r>
+      <w:r>
+        <w:rPr>
+          <w:rFonts w:ascii="Consolas" w:hAnsi="Consolas"/>
+          <w:sz w:val="21"/>
+        </w:rPr>
+        <w:t># 7. Deploy to Kubernetes</w:t>
+      </w:r>
+      <w:r>
+        <w:br/>
+      </w:r>
+      <w:r>
+        <w:rPr>
+          <w:rFonts w:ascii="Consolas" w:hAnsi="Consolas"/>
+          <w:sz w:val="21"/>
+        </w:rPr>
+        <w:t>kubectl apply -k k8s/</w:t>
+      </w:r>
+      <w:r>
+        <w:br/>
+      </w:r>
+      <w:r>
+        <w:rPr>
+          <w:rFonts w:ascii="Consolas" w:hAnsi="Consolas"/>
+          <w:sz w:val="21"/>
+        </w:rPr>
+        <w:t>kubectl rollout status deployment/heart-disease-api -n heart-disease</w:t>
+      </w:r>
+      <w:r>
+        <w:br/>
+      </w:r>
+      <w:r>
+        <w:br/>
+      </w:r>
+      <w:r>
+        <w:rPr>
+          <w:rFonts w:ascii="Consolas" w:hAnsi="Consolas"/>
+          <w:sz w:val="21"/>
+        </w:rPr>
+        <w:t># 8. Re-generate this PDF report</w:t>
+      </w:r>
+      <w:r>
+        <w:br/>
+      </w:r>
+      <w:r>
+        <w:rPr>
+          <w:rFonts w:ascii="Consolas" w:hAnsi="Consolas"/>
+          <w:sz w:val="21"/>
+        </w:rPr>
+        <w:t>python scripts/generate_report.py</w:t>
+      </w:r>
+    </w:p>
+    <w:p>
+      <w:pPr>
+        <w:spacing w:before="160" w:after="60"/>
+      </w:pPr>
+      <w:r>
+        <w:rPr>
+          <w:rFonts w:ascii="Calibri" w:hAnsi="Calibri"/>
+          <w:b/>
+          <w:color w:val="C0392B"/>
+          <w:sz w:val="23"/>
+        </w:rPr>
+        <w:t>Appendix B — Sample API Interaction</w:t>
+      </w:r>
+    </w:p>
+    <w:p>
+      <w:pPr>
+        <w:spacing w:after="80"/>
+        <w:jc w:val="both"/>
+      </w:pPr>
+      <w:r>
+        <w:rPr>
+          <w:rFonts w:ascii="Consolas" w:hAnsi="Consolas"/>
+          <w:sz w:val="21"/>
+        </w:rPr>
+        <w:t>$ curl -X POST http://localhost:8000/predict \</w:t>
+      </w:r>
+      <w:r>
+        <w:br/>
+      </w:r>
+      <w:r>
+        <w:rPr>
+          <w:rFonts w:ascii="Consolas" w:hAnsi="Consolas"/>
+          <w:sz w:val="21"/>
+        </w:rPr>
+        <w:t xml:space="preserve">    -H 'Content-Type: application/json' \</w:t>
+      </w:r>
+      <w:r>
+        <w:br/>
+      </w:r>
+      <w:r>
+        <w:rPr>
+          <w:rFonts w:ascii="Consolas" w:hAnsi="Consolas"/>
+          <w:sz w:val="21"/>
+        </w:rPr>
+        <w:t xml:space="preserve">    -d '{"age":63,"sex":1,"cp":1,"trestbps":145,</w:t>
+      </w:r>
+      <w:r>
+        <w:br/>
+      </w:r>
+      <w:r>
+        <w:rPr>
+          <w:rFonts w:ascii="Consolas" w:hAnsi="Consolas"/>
+          <w:sz w:val="21"/>
+        </w:rPr>
+        <w:t xml:space="preserve">        "chol":233,"fbs":1,"restecg":2,"thalach":150,</w:t>
+      </w:r>
+      <w:r>
+        <w:br/>
+      </w:r>
+      <w:r>
+        <w:rPr>
+          <w:rFonts w:ascii="Consolas" w:hAnsi="Consolas"/>
+          <w:sz w:val="21"/>
+        </w:rPr>
+        <w:t xml:space="preserve">        "exang":0,"oldpeak":2.3,"slope":3,"ca":0,"thal":6}'</w:t>
+      </w:r>
+      <w:r>
+        <w:br/>
+      </w:r>
+      <w:r>
+        <w:br/>
+      </w:r>
+      <w:r>
+        <w:rPr>
+          <w:rFonts w:ascii="Consolas" w:hAnsi="Consolas"/>
+          <w:sz w:val="21"/>
+        </w:rPr>
+        <w:t>{</w:t>
+      </w:r>
+      <w:r>
+        <w:br/>
+      </w:r>
+      <w:r>
+        <w:rPr>
+          <w:rFonts w:ascii="Consolas" w:hAnsi="Consolas"/>
+          <w:sz w:val="21"/>
+        </w:rPr>
+        <w:t xml:space="preserve">  "prediction": 0,</w:t>
+      </w:r>
+      <w:r>
+        <w:br/>
+      </w:r>
+      <w:r>
+        <w:rPr>
+          <w:rFonts w:ascii="Consolas" w:hAnsi="Consolas"/>
+          <w:sz w:val="21"/>
+        </w:rPr>
+        <w:t xml:space="preserve">  "label": "No disease",</w:t>
+      </w:r>
+      <w:r>
+        <w:br/>
+      </w:r>
+      <w:r>
+        <w:rPr>
+          <w:rFonts w:ascii="Consolas" w:hAnsi="Consolas"/>
+          <w:sz w:val="21"/>
+        </w:rPr>
+        <w:t xml:space="preserve">  "probability": 0.1718,</w:t>
+      </w:r>
+      <w:r>
+        <w:br/>
+      </w:r>
+      <w:r>
+        <w:rPr>
+          <w:rFonts w:ascii="Consolas" w:hAnsi="Consolas"/>
+          <w:sz w:val="21"/>
+        </w:rPr>
+        <w:t xml:space="preserve">  "confidence": 0.8282,</w:t>
+      </w:r>
+      <w:r>
+        <w:br/>
+      </w:r>
+      <w:r>
+        <w:rPr>
+          <w:rFonts w:ascii="Consolas" w:hAnsi="Consolas"/>
+          <w:sz w:val="21"/>
+        </w:rPr>
+        <w:t xml:space="preserve">  "model_version": "v1.0.0"</w:t>
+      </w:r>
+      <w:r>
+        <w:br/>
+      </w:r>
+      <w:r>
+        <w:rPr>
+          <w:rFonts w:ascii="Consolas" w:hAnsi="Consolas"/>
+          <w:sz w:val="21"/>
+        </w:rPr>
+        <w:t>}</w:t>
+      </w:r>
+    </w:p>
+    <w:p>
+      <w:pPr>
+        <w:spacing w:before="160" w:after="60"/>
+      </w:pPr>
+      <w:r>
+        <w:rPr>
+          <w:rFonts w:ascii="Calibri" w:hAnsi="Calibri"/>
+          <w:b/>
+          <w:color w:val="C0392B"/>
+          <w:sz w:val="23"/>
+        </w:rPr>
+        <w:t>Appendix C — References</w:t>
+      </w:r>
+    </w:p>
+    <w:p>
+      <w:pPr>
+        <w:spacing w:after="40"/>
+        <w:ind w:left="340"/>
+        <w:numPr>
+          <w:ilvl w:val="0"/>
+          <w:numId w:val="1"/>
+        </w:numPr>
+      </w:pPr>
+      <w:r>
+        <w:rPr>
+          <w:rFonts w:ascii="Calibri" w:hAnsi="Calibri"/>
+          <w:sz w:val="21"/>
+        </w:rPr>
+        <w:t>UCI Heart Disease dataset — https://archive.ics.uci.edu/dataset/45/heart+disease</w:t>
+      </w:r>
+    </w:p>
+    <w:p>
+      <w:pPr>
+        <w:spacing w:after="40"/>
+        <w:ind w:left="340"/>
+        <w:numPr>
+          <w:ilvl w:val="0"/>
+          <w:numId w:val="1"/>
+        </w:numPr>
+      </w:pPr>
+      <w:r>
+        <w:rPr>
+          <w:rFonts w:ascii="Calibri" w:hAnsi="Calibri"/>
+          <w:sz w:val="21"/>
+        </w:rPr>
+        <w:t>scikit-learn user guide — Pipelines and ColumnTransformer.</w:t>
+      </w:r>
+    </w:p>
+    <w:p>
+      <w:pPr>
+        <w:spacing w:after="40"/>
+        <w:ind w:left="340"/>
+        <w:numPr>
+          <w:ilvl w:val="0"/>
+          <w:numId w:val="1"/>
+        </w:numPr>
+      </w:pPr>
+      <w:r>
+        <w:rPr>
+          <w:rFonts w:ascii="Calibri" w:hAnsi="Calibri"/>
+          <w:sz w:val="21"/>
+        </w:rPr>
+        <w:t>MLflow tracking documentation — https://mlflow.org/docs/latest/tracking.html</w:t>
+      </w:r>
+    </w:p>
+    <w:p>
+      <w:pPr>
+        <w:spacing w:after="40"/>
+        <w:ind w:left="340"/>
+        <w:numPr>
+          <w:ilvl w:val="0"/>
+          <w:numId w:val="1"/>
+        </w:numPr>
+      </w:pPr>
+      <w:r>
+        <w:rPr>
+          <w:rFonts w:ascii="Calibri" w:hAnsi="Calibri"/>
+          <w:sz w:val="21"/>
+        </w:rPr>
+        <w:t>Prometheus best-practice metric naming — https://prometheus.io/docs/practices/naming/</w:t>
+      </w:r>
+    </w:p>
+    <w:p>
+      <w:pPr>
+        <w:spacing w:after="40"/>
+        <w:ind w:left="340"/>
+        <w:numPr>
+          <w:ilvl w:val="0"/>
+          <w:numId w:val="1"/>
+        </w:numPr>
+      </w:pPr>
+      <w:r>
+        <w:rPr>
+          <w:rFonts w:ascii="Calibri" w:hAnsi="Calibri"/>
           <w:sz w:val="21"/>
         </w:rPr>
         <w:t>Kubernetes — Probes, Resource Management and HPA reference.</w:t>
+      </w:r>
+    </w:p>
+    <w:p>
+      <w:pPr>
+        <w:spacing w:before="240" w:after="120"/>
+      </w:pPr>
+      <w:r>
+        <w:rPr>
+          <w:rFonts w:ascii="Calibri" w:hAnsi="Calibri"/>
+          <w:b/>
+          <w:color w:val="1F4E79"/>
+          <w:sz w:val="30"/>
+        </w:rPr>
+        <w:t>Appendix D — Deliverables Index</w:t>
+      </w:r>
+    </w:p>
+    <w:p>
+      <w:pPr>
+        <w:spacing w:after="80"/>
+        <w:jc w:val="both"/>
+      </w:pPr>
+      <w:r>
+        <w:rPr>
+          <w:rFonts w:ascii="Calibri" w:hAnsi="Calibri"/>
+          <w:sz w:val="21"/>
+        </w:rPr>
+        <w:t>All artefacts referenced in this report are tracked in the public GitHub repository:</w:t>
+      </w:r>
+    </w:p>
+    <w:p>
+      <w:pPr>
+        <w:spacing w:after="80"/>
+        <w:jc w:val="both"/>
+      </w:pPr>
+      <w:r>
+        <w:rPr>
+          <w:rFonts w:ascii="Calibri" w:hAnsi="Calibri"/>
+          <w:b/>
+          <w:sz w:val="21"/>
+        </w:rPr>
+        <w:t>Repository:</w:t>
+      </w:r>
+      <w:r>
+        <w:rPr>
+          <w:rFonts w:ascii="Calibri" w:hAnsi="Calibri"/>
+          <w:sz w:val="21"/>
+        </w:rPr>
+        <w:t xml:space="preserve"> https://github.com/2025cs05050-rgb/heart-disease-mlops</w:t>
+      </w:r>
+    </w:p>
+    <w:p>
+      <w:pPr>
+        <w:spacing w:before="160" w:after="60"/>
+      </w:pPr>
+      <w:r>
+        <w:rPr>
+          <w:rFonts w:ascii="Calibri" w:hAnsi="Calibri"/>
+          <w:b/>
+          <w:color w:val="C0392B"/>
+          <w:sz w:val="23"/>
+        </w:rPr>
+        <w:t>Notebooks (with exported PDFs)</w:t>
+      </w:r>
+    </w:p>
+    <w:p>
+      <w:pPr>
+        <w:spacing w:after="40"/>
+        <w:ind w:left="340"/>
+        <w:numPr>
+          <w:ilvl w:val="0"/>
+          <w:numId w:val="1"/>
+        </w:numPr>
+      </w:pPr>
+      <w:r>
+        <w:rPr>
+          <w:rFonts w:ascii="Consolas" w:hAnsi="Consolas"/>
+          <w:sz w:val="21"/>
+        </w:rPr>
+        <w:t>notebooks/01_eda.ipynb</w:t>
+      </w:r>
+      <w:r>
+        <w:rPr>
+          <w:rFonts w:ascii="Calibri" w:hAnsi="Calibri"/>
+          <w:sz w:val="21"/>
+        </w:rPr>
+        <w:t xml:space="preserve"> — </w:t>
+      </w:r>
+      <w:r>
+        <w:rPr>
+          <w:rFonts w:ascii="Calibri" w:hAnsi="Calibri"/>
+          <w:i/>
+          <w:sz w:val="21"/>
+        </w:rPr>
+        <w:t>Exploratory_Data_Analysis.pdf</w:t>
+      </w:r>
+    </w:p>
+    <w:p>
+      <w:pPr>
+        <w:spacing w:after="40"/>
+        <w:ind w:left="340"/>
+        <w:numPr>
+          <w:ilvl w:val="0"/>
+          <w:numId w:val="1"/>
+        </w:numPr>
+      </w:pPr>
+      <w:r>
+        <w:rPr>
+          <w:rFonts w:ascii="Consolas" w:hAnsi="Consolas"/>
+          <w:sz w:val="21"/>
+        </w:rPr>
+        <w:t>notebooks/02_preprocessing.ipynb</w:t>
+      </w:r>
+      <w:r>
+        <w:rPr>
+          <w:rFonts w:ascii="Calibri" w:hAnsi="Calibri"/>
+          <w:sz w:val="21"/>
+        </w:rPr>
+        <w:t xml:space="preserve"> — </w:t>
+      </w:r>
+      <w:r>
+        <w:rPr>
+          <w:rFonts w:ascii="Calibri" w:hAnsi="Calibri"/>
+          <w:i/>
+          <w:sz w:val="21"/>
+        </w:rPr>
+        <w:t>Preprocessing.pdf</w:t>
+      </w:r>
+    </w:p>
+    <w:p>
+      <w:pPr>
+        <w:spacing w:after="40"/>
+        <w:ind w:left="340"/>
+        <w:numPr>
+          <w:ilvl w:val="0"/>
+          <w:numId w:val="1"/>
+        </w:numPr>
+      </w:pPr>
+      <w:r>
+        <w:rPr>
+          <w:rFonts w:ascii="Consolas" w:hAnsi="Consolas"/>
+          <w:sz w:val="21"/>
+        </w:rPr>
+        <w:t>notebooks/03_model_training.ipynb</w:t>
+      </w:r>
+      <w:r>
+        <w:rPr>
+          <w:rFonts w:ascii="Calibri" w:hAnsi="Calibri"/>
+          <w:sz w:val="21"/>
+        </w:rPr>
+        <w:t xml:space="preserve"> — </w:t>
+      </w:r>
+      <w:r>
+        <w:rPr>
+          <w:rFonts w:ascii="Calibri" w:hAnsi="Calibri"/>
+          <w:i/>
+          <w:sz w:val="21"/>
+        </w:rPr>
+        <w:t>Model_Training.pdf</w:t>
+      </w:r>
+    </w:p>
+    <w:p>
+      <w:pPr>
+        <w:spacing w:after="40"/>
+        <w:ind w:left="340"/>
+        <w:numPr>
+          <w:ilvl w:val="0"/>
+          <w:numId w:val="1"/>
+        </w:numPr>
+      </w:pPr>
+      <w:r>
+        <w:rPr>
+          <w:rFonts w:ascii="Consolas" w:hAnsi="Consolas"/>
+          <w:sz w:val="21"/>
+        </w:rPr>
+        <w:t>notebooks/04_inference.ipynb</w:t>
+      </w:r>
+      <w:r>
+        <w:rPr>
+          <w:rFonts w:ascii="Calibri" w:hAnsi="Calibri"/>
+          <w:sz w:val="21"/>
+        </w:rPr>
+        <w:t xml:space="preserve"> — </w:t>
+      </w:r>
+      <w:r>
+        <w:rPr>
+          <w:rFonts w:ascii="Calibri" w:hAnsi="Calibri"/>
+          <w:i/>
+          <w:sz w:val="21"/>
+        </w:rPr>
+        <w:t>Inference.pdf</w:t>
+      </w:r>
+    </w:p>
+    <w:p>
+      <w:pPr>
+        <w:spacing w:after="40"/>
+        <w:ind w:left="340"/>
+        <w:numPr>
+          <w:ilvl w:val="0"/>
+          <w:numId w:val="1"/>
+        </w:numPr>
+      </w:pPr>
+      <w:r>
+        <w:rPr>
+          <w:rFonts w:ascii="Consolas" w:hAnsi="Consolas"/>
+          <w:sz w:val="21"/>
+        </w:rPr>
+        <w:t>notebooks/05_containerisation.ipynb</w:t>
+      </w:r>
+      <w:r>
+        <w:rPr>
+          <w:rFonts w:ascii="Calibri" w:hAnsi="Calibri"/>
+          <w:sz w:val="21"/>
+        </w:rPr>
+        <w:t xml:space="preserve"> — </w:t>
+      </w:r>
+      <w:r>
+        <w:rPr>
+          <w:rFonts w:ascii="Calibri" w:hAnsi="Calibri"/>
+          <w:i/>
+          <w:sz w:val="21"/>
+        </w:rPr>
+        <w:t>Containerisation.pdf</w:t>
+      </w:r>
+    </w:p>
+    <w:p>
+      <w:pPr>
+        <w:spacing w:after="40"/>
+        <w:ind w:left="340"/>
+        <w:numPr>
+          <w:ilvl w:val="0"/>
+          <w:numId w:val="1"/>
+        </w:numPr>
+      </w:pPr>
+      <w:r>
+        <w:rPr>
+          <w:rFonts w:ascii="Consolas" w:hAnsi="Consolas"/>
+          <w:sz w:val="21"/>
+        </w:rPr>
+        <w:t>notebooks/06_kubernetes.ipynb</w:t>
+      </w:r>
+      <w:r>
+        <w:rPr>
+          <w:rFonts w:ascii="Calibri" w:hAnsi="Calibri"/>
+          <w:sz w:val="21"/>
+        </w:rPr>
+        <w:t xml:space="preserve"> — </w:t>
+      </w:r>
+      <w:r>
+        <w:rPr>
+          <w:rFonts w:ascii="Calibri" w:hAnsi="Calibri"/>
+          <w:i/>
+          <w:sz w:val="21"/>
+        </w:rPr>
+        <w:t>Kubernetes.pdf</w:t>
+      </w:r>
+    </w:p>
+    <w:p>
+      <w:pPr>
+        <w:spacing w:after="40"/>
+        <w:ind w:left="340"/>
+        <w:numPr>
+          <w:ilvl w:val="0"/>
+          <w:numId w:val="1"/>
+        </w:numPr>
+      </w:pPr>
+      <w:r>
+        <w:rPr>
+          <w:rFonts w:ascii="Consolas" w:hAnsi="Consolas"/>
+          <w:sz w:val="21"/>
+        </w:rPr>
+        <w:t>notebooks/07_monitoring.ipynb</w:t>
+      </w:r>
+      <w:r>
+        <w:rPr>
+          <w:rFonts w:ascii="Calibri" w:hAnsi="Calibri"/>
+          <w:sz w:val="21"/>
+        </w:rPr>
+        <w:t xml:space="preserve"> — </w:t>
+      </w:r>
+      <w:r>
+        <w:rPr>
+          <w:rFonts w:ascii="Calibri" w:hAnsi="Calibri"/>
+          <w:i/>
+          <w:sz w:val="21"/>
+        </w:rPr>
+        <w:t>Monitoring.pdf</w:t>
+      </w:r>
+    </w:p>
+    <w:p>
+      <w:pPr>
+        <w:spacing w:before="160" w:after="60"/>
+      </w:pPr>
+      <w:r>
+        <w:rPr>
+          <w:rFonts w:ascii="Calibri" w:hAnsi="Calibri"/>
+          <w:b/>
+          <w:color w:val="C0392B"/>
+          <w:sz w:val="23"/>
+        </w:rPr>
+        <w:t>Source code</w:t>
+      </w:r>
+    </w:p>
+    <w:p>
+      <w:pPr>
+        <w:spacing w:after="40"/>
+        <w:ind w:left="340"/>
+        <w:numPr>
+          <w:ilvl w:val="0"/>
+          <w:numId w:val="1"/>
+        </w:numPr>
+      </w:pPr>
+      <w:r>
+        <w:rPr>
+          <w:rFonts w:ascii="Consolas" w:hAnsi="Consolas"/>
+          <w:sz w:val="21"/>
+        </w:rPr>
+        <w:t>src/data_loader.py</w:t>
+      </w:r>
+      <w:r>
+        <w:rPr>
+          <w:rFonts w:ascii="Calibri" w:hAnsi="Calibri"/>
+          <w:sz w:val="21"/>
+        </w:rPr>
+        <w:t xml:space="preserve">, </w:t>
+      </w:r>
+      <w:r>
+        <w:rPr>
+          <w:rFonts w:ascii="Consolas" w:hAnsi="Consolas"/>
+          <w:sz w:val="21"/>
+        </w:rPr>
+        <w:t>src/preprocess.py</w:t>
+      </w:r>
+      <w:r>
+        <w:rPr>
+          <w:rFonts w:ascii="Calibri" w:hAnsi="Calibri"/>
+          <w:sz w:val="21"/>
+        </w:rPr>
+        <w:t xml:space="preserve">, </w:t>
+      </w:r>
+      <w:r>
+        <w:rPr>
+          <w:rFonts w:ascii="Consolas" w:hAnsi="Consolas"/>
+          <w:sz w:val="21"/>
+        </w:rPr>
+        <w:t>src/train.py</w:t>
+      </w:r>
+      <w:r>
+        <w:rPr>
+          <w:rFonts w:ascii="Calibri" w:hAnsi="Calibri"/>
+          <w:sz w:val="21"/>
+        </w:rPr>
+        <w:t xml:space="preserve">, </w:t>
+      </w:r>
+      <w:r>
+        <w:rPr>
+          <w:rFonts w:ascii="Consolas" w:hAnsi="Consolas"/>
+          <w:sz w:val="21"/>
+        </w:rPr>
+        <w:t>src/evaluate.py</w:t>
+      </w:r>
+      <w:r>
+        <w:rPr>
+          <w:rFonts w:ascii="Calibri" w:hAnsi="Calibri"/>
+          <w:sz w:val="21"/>
+        </w:rPr>
+        <w:t xml:space="preserve">, </w:t>
+      </w:r>
+      <w:r>
+        <w:rPr>
+          <w:rFonts w:ascii="Consolas" w:hAnsi="Consolas"/>
+          <w:sz w:val="21"/>
+        </w:rPr>
+        <w:t>src/predict.py</w:t>
+      </w:r>
+      <w:r>
+        <w:rPr>
+          <w:rFonts w:ascii="Calibri" w:hAnsi="Calibri"/>
+          <w:sz w:val="21"/>
+        </w:rPr>
+        <w:t xml:space="preserve"> — pipeline modules.</w:t>
+      </w:r>
+    </w:p>
+    <w:p>
+      <w:pPr>
+        <w:spacing w:after="40"/>
+        <w:ind w:left="340"/>
+        <w:numPr>
+          <w:ilvl w:val="0"/>
+          <w:numId w:val="1"/>
+        </w:numPr>
+      </w:pPr>
+      <w:r>
+        <w:rPr>
+          <w:rFonts w:ascii="Consolas" w:hAnsi="Consolas"/>
+          <w:sz w:val="21"/>
+        </w:rPr>
+        <w:t>api/</w:t>
+      </w:r>
+      <w:r>
+        <w:rPr>
+          <w:rFonts w:ascii="Calibri" w:hAnsi="Calibri"/>
+          <w:sz w:val="21"/>
+        </w:rPr>
+        <w:t xml:space="preserve"> — FastAPI service (app, schemas, logging, metrics).</w:t>
+      </w:r>
+    </w:p>
+    <w:p>
+      <w:pPr>
+        <w:spacing w:after="40"/>
+        <w:ind w:left="340"/>
+        <w:numPr>
+          <w:ilvl w:val="0"/>
+          <w:numId w:val="1"/>
+        </w:numPr>
+      </w:pPr>
+      <w:r>
+        <w:rPr>
+          <w:rFonts w:ascii="Consolas" w:hAnsi="Consolas"/>
+          <w:sz w:val="21"/>
+        </w:rPr>
+        <w:t>tests/</w:t>
+      </w:r>
+      <w:r>
+        <w:rPr>
+          <w:rFonts w:ascii="Calibri" w:hAnsi="Calibri"/>
+          <w:sz w:val="21"/>
+        </w:rPr>
+        <w:t xml:space="preserve"> — pytest suite (35 tests).</w:t>
+      </w:r>
+    </w:p>
+    <w:p>
+      <w:pPr>
+        <w:spacing w:before="160" w:after="60"/>
+      </w:pPr>
+      <w:r>
+        <w:rPr>
+          <w:rFonts w:ascii="Calibri" w:hAnsi="Calibri"/>
+          <w:b/>
+          <w:color w:val="C0392B"/>
+          <w:sz w:val="23"/>
+        </w:rPr>
+        <w:t>Infrastructure</w:t>
+      </w:r>
+    </w:p>
+    <w:p>
+      <w:pPr>
+        <w:spacing w:after="40"/>
+        <w:ind w:left="340"/>
+        <w:numPr>
+          <w:ilvl w:val="0"/>
+          <w:numId w:val="1"/>
+        </w:numPr>
+      </w:pPr>
+      <w:r>
+        <w:rPr>
+          <w:rFonts w:ascii="Consolas" w:hAnsi="Consolas"/>
+          <w:sz w:val="21"/>
+        </w:rPr>
+        <w:t>docker/Dockerfile</w:t>
+      </w:r>
+      <w:r>
+        <w:rPr>
+          <w:rFonts w:ascii="Calibri" w:hAnsi="Calibri"/>
+          <w:sz w:val="21"/>
+        </w:rPr>
+        <w:t xml:space="preserve"> — multi-stage build that bakes the trained model.</w:t>
+      </w:r>
+    </w:p>
+    <w:p>
+      <w:pPr>
+        <w:spacing w:after="40"/>
+        <w:ind w:left="340"/>
+        <w:numPr>
+          <w:ilvl w:val="0"/>
+          <w:numId w:val="1"/>
+        </w:numPr>
+      </w:pPr>
+      <w:r>
+        <w:rPr>
+          <w:rFonts w:ascii="Consolas" w:hAnsi="Consolas"/>
+          <w:sz w:val="21"/>
+        </w:rPr>
+        <w:t>docker/Dockerfile.slim</w:t>
+      </w:r>
+      <w:r>
+        <w:rPr>
+          <w:rFonts w:ascii="Calibri" w:hAnsi="Calibri"/>
+          <w:sz w:val="21"/>
+        </w:rPr>
+        <w:t xml:space="preserve"> — runtime-only variant used for low-IO sandboxes (Killercoda).</w:t>
+      </w:r>
+    </w:p>
+    <w:p>
+      <w:pPr>
+        <w:spacing w:after="40"/>
+        <w:ind w:left="340"/>
+        <w:numPr>
+          <w:ilvl w:val="0"/>
+          <w:numId w:val="1"/>
+        </w:numPr>
+      </w:pPr>
+      <w:r>
+        <w:rPr>
+          <w:rFonts w:ascii="Consolas" w:hAnsi="Consolas"/>
+          <w:sz w:val="21"/>
+        </w:rPr>
+        <w:t>k8s/</w:t>
+      </w:r>
+      <w:r>
+        <w:rPr>
+          <w:rFonts w:ascii="Calibri" w:hAnsi="Calibri"/>
+          <w:sz w:val="21"/>
+        </w:rPr>
+        <w:t xml:space="preserve"> — namespace, configmap, deployment, service, ingress, HPA, kustomization.</w:t>
+      </w:r>
+    </w:p>
+    <w:p>
+      <w:pPr>
+        <w:spacing w:after="40"/>
+        <w:ind w:left="340"/>
+        <w:numPr>
+          <w:ilvl w:val="0"/>
+          <w:numId w:val="1"/>
+        </w:numPr>
+      </w:pPr>
+      <w:r>
+        <w:rPr>
+          <w:rFonts w:ascii="Consolas" w:hAnsi="Consolas"/>
+          <w:sz w:val="21"/>
+        </w:rPr>
+        <w:t>monitoring/</w:t>
+      </w:r>
+      <w:r>
+        <w:rPr>
+          <w:rFonts w:ascii="Calibri" w:hAnsi="Calibri"/>
+          <w:sz w:val="21"/>
+        </w:rPr>
+        <w:t xml:space="preserve"> — docker-compose, Prometheus config, Grafana dashboard JSON.</w:t>
+      </w:r>
+    </w:p>
+    <w:p>
+      <w:pPr>
+        <w:spacing w:after="40"/>
+        <w:ind w:left="340"/>
+        <w:numPr>
+          <w:ilvl w:val="0"/>
+          <w:numId w:val="1"/>
+        </w:numPr>
+      </w:pPr>
+      <w:r>
+        <w:rPr>
+          <w:rFonts w:ascii="Consolas" w:hAnsi="Consolas"/>
+          <w:sz w:val="21"/>
+        </w:rPr>
+        <w:t>.github/workflows/ci.yml</w:t>
+      </w:r>
+      <w:r>
+        <w:rPr>
+          <w:rFonts w:ascii="Calibri" w:hAnsi="Calibri"/>
+          <w:sz w:val="21"/>
+        </w:rPr>
+        <w:t xml:space="preserve"> — lint, test, smoke-train and Docker-build jobs.</w:t>
+      </w:r>
+    </w:p>
+    <w:p>
+      <w:pPr>
+        <w:spacing w:before="160" w:after="60"/>
+      </w:pPr>
+      <w:r>
+        <w:rPr>
+          <w:rFonts w:ascii="Calibri" w:hAnsi="Calibri"/>
+          <w:b/>
+          <w:color w:val="C0392B"/>
+          <w:sz w:val="23"/>
+        </w:rPr>
+        <w:t>Reports</w:t>
+      </w:r>
+    </w:p>
+    <w:p>
+      <w:pPr>
+        <w:spacing w:after="40"/>
+        <w:ind w:left="340"/>
+        <w:numPr>
+          <w:ilvl w:val="0"/>
+          <w:numId w:val="1"/>
+        </w:numPr>
+      </w:pPr>
+      <w:r>
+        <w:rPr>
+          <w:rFonts w:ascii="Consolas" w:hAnsi="Consolas"/>
+          <w:sz w:val="21"/>
+        </w:rPr>
+        <w:t>reports/MLOps_Assignment1_Report.pdf</w:t>
+      </w:r>
+      <w:r>
+        <w:rPr>
+          <w:rFonts w:ascii="Calibri" w:hAnsi="Calibri"/>
+          <w:sz w:val="21"/>
+        </w:rPr>
+        <w:t xml:space="preserve"> — this consolidated report (PDF).</w:t>
+      </w:r>
+    </w:p>
+    <w:p>
+      <w:pPr>
+        <w:spacing w:after="40"/>
+        <w:ind w:left="340"/>
+        <w:numPr>
+          <w:ilvl w:val="0"/>
+          <w:numId w:val="1"/>
+        </w:numPr>
+      </w:pPr>
+      <w:r>
+        <w:rPr>
+          <w:rFonts w:ascii="Consolas" w:hAnsi="Consolas"/>
+          <w:sz w:val="21"/>
+        </w:rPr>
+        <w:t>reports/MLOps_Assignment1_Report.docx</w:t>
+      </w:r>
+      <w:r>
+        <w:rPr>
+          <w:rFonts w:ascii="Calibri" w:hAnsi="Calibri"/>
+          <w:sz w:val="21"/>
+        </w:rPr>
+        <w:t xml:space="preserve"> — Word version of this report.</w:t>
+      </w:r>
+    </w:p>
+    <w:p>
+      <w:pPr>
+        <w:spacing w:after="40"/>
+        <w:ind w:left="340"/>
+        <w:numPr>
+          <w:ilvl w:val="0"/>
+          <w:numId w:val="1"/>
+        </w:numPr>
+      </w:pPr>
+      <w:r>
+        <w:rPr>
+          <w:rFonts w:ascii="Consolas" w:hAnsi="Consolas"/>
+          <w:sz w:val="21"/>
+        </w:rPr>
+        <w:t>reports/metrics.json</w:t>
+      </w:r>
+      <w:r>
+        <w:rPr>
+          <w:rFonts w:ascii="Calibri" w:hAnsi="Calibri"/>
+          <w:sz w:val="21"/>
+        </w:rPr>
+        <w:t xml:space="preserve"> — CV + test metrics for both candidate models, consumed by the report generators.</w:t>
+      </w:r>
+    </w:p>
+    <w:p>
+      <w:pPr>
+        <w:spacing w:after="40"/>
+        <w:ind w:left="340"/>
+        <w:numPr>
+          <w:ilvl w:val="0"/>
+          <w:numId w:val="1"/>
+        </w:numPr>
+      </w:pPr>
+      <w:r>
+        <w:rPr>
+          <w:rFonts w:ascii="Consolas" w:hAnsi="Consolas"/>
+          <w:sz w:val="21"/>
+        </w:rPr>
+        <w:t>reports/figures/</w:t>
+      </w:r>
+      <w:r>
+        <w:rPr>
+          <w:rFonts w:ascii="Calibri" w:hAnsi="Calibri"/>
+          <w:sz w:val="21"/>
+        </w:rPr>
+        <w:t xml:space="preserve"> — confusion matrix, ROC curve, MLflow / Swagger / Grafana renderings.</w:t>
+      </w:r>
+    </w:p>
+    <w:p>
+      <w:pPr>
+        <w:spacing w:after="40"/>
+        <w:ind w:left="340"/>
+        <w:numPr>
+          <w:ilvl w:val="0"/>
+          <w:numId w:val="1"/>
+        </w:numPr>
+      </w:pPr>
+      <w:r>
+        <w:rPr>
+          <w:rFonts w:ascii="Consolas" w:hAnsi="Consolas"/>
+          <w:sz w:val="21"/>
+        </w:rPr>
+        <w:t>screenshots/</w:t>
+      </w:r>
+      <w:r>
+        <w:rPr>
+          <w:rFonts w:ascii="Calibri" w:hAnsi="Calibri"/>
+          <w:sz w:val="21"/>
+        </w:rPr>
+        <w:t xml:space="preserve"> — seven Killercoda deployment screenshots embedded as Figures 6-12.</w:t>
       </w:r>
     </w:p>
     <w:sectPr>

</xml_diff>

<commit_message>
docs(report): add Production Deployment section, Killercoda screenshots, GitHub link and Deliverables Index; relocate notebook PDFs to reports/
</commit_message>
<xml_diff>
--- a/reports/MLOps_Assignment1_Report.docx
+++ b/reports/MLOps_Assignment1_Report.docx
@@ -5864,11 +5864,10 @@
       </w:r>
       <w:r>
         <w:rPr>
-          <w:rFonts w:ascii="Calibri" w:hAnsi="Calibri"/>
-          <w:i/>
-          <w:sz w:val="21"/>
-        </w:rPr>
-        <w:t>Exploratory_Data_Analysis.pdf</w:t>
+          <w:rFonts w:ascii="Consolas" w:hAnsi="Consolas"/>
+          <w:sz w:val="21"/>
+        </w:rPr>
+        <w:t>reports/01_Exploratory_Data_Analysis.pdf</w:t>
       </w:r>
     </w:p>
     <w:p>
@@ -5896,11 +5895,10 @@
       </w:r>
       <w:r>
         <w:rPr>
-          <w:rFonts w:ascii="Calibri" w:hAnsi="Calibri"/>
-          <w:i/>
-          <w:sz w:val="21"/>
-        </w:rPr>
-        <w:t>Preprocessing.pdf</w:t>
+          <w:rFonts w:ascii="Consolas" w:hAnsi="Consolas"/>
+          <w:sz w:val="21"/>
+        </w:rPr>
+        <w:t>reports/02_Preprocessing.pdf</w:t>
       </w:r>
     </w:p>
     <w:p>
@@ -5928,11 +5926,10 @@
       </w:r>
       <w:r>
         <w:rPr>
-          <w:rFonts w:ascii="Calibri" w:hAnsi="Calibri"/>
-          <w:i/>
-          <w:sz w:val="21"/>
-        </w:rPr>
-        <w:t>Model_Training.pdf</w:t>
+          <w:rFonts w:ascii="Consolas" w:hAnsi="Consolas"/>
+          <w:sz w:val="21"/>
+        </w:rPr>
+        <w:t>reports/03_Model_Training.pdf</w:t>
       </w:r>
     </w:p>
     <w:p>
@@ -5960,11 +5957,10 @@
       </w:r>
       <w:r>
         <w:rPr>
-          <w:rFonts w:ascii="Calibri" w:hAnsi="Calibri"/>
-          <w:i/>
-          <w:sz w:val="21"/>
-        </w:rPr>
-        <w:t>Inference.pdf</w:t>
+          <w:rFonts w:ascii="Consolas" w:hAnsi="Consolas"/>
+          <w:sz w:val="21"/>
+        </w:rPr>
+        <w:t>reports/04_Inference.pdf</w:t>
       </w:r>
     </w:p>
     <w:p>
@@ -5992,11 +5988,10 @@
       </w:r>
       <w:r>
         <w:rPr>
-          <w:rFonts w:ascii="Calibri" w:hAnsi="Calibri"/>
-          <w:i/>
-          <w:sz w:val="21"/>
-        </w:rPr>
-        <w:t>Containerisation.pdf</w:t>
+          <w:rFonts w:ascii="Consolas" w:hAnsi="Consolas"/>
+          <w:sz w:val="21"/>
+        </w:rPr>
+        <w:t>reports/05_Containerisation.pdf</w:t>
       </w:r>
     </w:p>
     <w:p>
@@ -6024,11 +6019,10 @@
       </w:r>
       <w:r>
         <w:rPr>
-          <w:rFonts w:ascii="Calibri" w:hAnsi="Calibri"/>
-          <w:i/>
-          <w:sz w:val="21"/>
-        </w:rPr>
-        <w:t>Kubernetes.pdf</w:t>
+          <w:rFonts w:ascii="Consolas" w:hAnsi="Consolas"/>
+          <w:sz w:val="21"/>
+        </w:rPr>
+        <w:t>reports/06_Kubernetes.pdf</w:t>
       </w:r>
     </w:p>
     <w:p>
@@ -6056,11 +6050,10 @@
       </w:r>
       <w:r>
         <w:rPr>
-          <w:rFonts w:ascii="Calibri" w:hAnsi="Calibri"/>
-          <w:i/>
-          <w:sz w:val="21"/>
-        </w:rPr>
-        <w:t>Monitoring.pdf</w:t>
+          <w:rFonts w:ascii="Consolas" w:hAnsi="Consolas"/>
+          <w:sz w:val="21"/>
+        </w:rPr>
+        <w:t>reports/07_Monitoring.pdf</w:t>
       </w:r>
     </w:p>
     <w:p>

</xml_diff>

<commit_message>
docs(report): embed clickable GitHub blob URLs for every notebook, source file, infra and report deliverable (32 hyperlinks in PDF + DOCX)
</commit_message>
<xml_diff>
--- a/reports/MLOps_Assignment1_Report.docx
+++ b/reports/MLOps_Assignment1_Report.docx
@@ -5801,7 +5801,22 @@
           <w:rFonts w:ascii="Calibri" w:hAnsi="Calibri"/>
           <w:sz w:val="21"/>
         </w:rPr>
-        <w:t>All artefacts referenced in this report are tracked in the public GitHub repository:</w:t>
+        <w:t xml:space="preserve">All artefacts referenced in this report are tracked in the public GitHub repository. Every entry below carries a clickable link to the exact file on the </w:t>
+      </w:r>
+      <w:r>
+        <w:rPr>
+          <w:rFonts w:ascii="Calibri" w:hAnsi="Calibri"/>
+          <w:i/>
+          <w:sz w:val="21"/>
+        </w:rPr>
+        <w:t>main</w:t>
+      </w:r>
+      <w:r>
+        <w:rPr>
+          <w:rFonts w:ascii="Calibri" w:hAnsi="Calibri"/>
+          <w:sz w:val="21"/>
+        </w:rPr>
+        <w:t xml:space="preserve"> branch.</w:t>
       </w:r>
     </w:p>
     <w:p>
@@ -5822,8 +5837,19 @@
           <w:rFonts w:ascii="Calibri" w:hAnsi="Calibri"/>
           <w:sz w:val="21"/>
         </w:rPr>
-        <w:t xml:space="preserve"> https://github.com/2025cs05050-rgb/heart-disease-mlops</w:t>
-      </w:r>
+        <w:t xml:space="preserve"> </w:t>
+      </w:r>
+      <w:hyperlink r:id="rId22">
+        <w:r>
+          <w:rPr>
+            <w:rFonts w:ascii="Calibri" w:hAnsi="Calibri"/>
+            <w:color w:val="1F4E79"/>
+            <w:u w:val="single"/>
+            <w:sz w:val="21"/>
+          </w:rPr>
+          <w:t xml:space="preserve">https://github.com/2025cs05050-rgb/heart-disease-mlops</w:t>
+        </w:r>
+      </w:hyperlink>
     </w:p>
     <w:p>
       <w:pPr>
@@ -5853,22 +5879,44 @@
           <w:rFonts w:ascii="Consolas" w:hAnsi="Consolas"/>
           <w:sz w:val="21"/>
         </w:rPr>
-        <w:t>notebooks/01_eda.ipynb</w:t>
-      </w:r>
-      <w:r>
-        <w:rPr>
-          <w:rFonts w:ascii="Calibri" w:hAnsi="Calibri"/>
-          <w:sz w:val="21"/>
-        </w:rPr>
-        <w:t xml:space="preserve"> — </w:t>
-      </w:r>
-      <w:r>
-        <w:rPr>
-          <w:rFonts w:ascii="Consolas" w:hAnsi="Consolas"/>
-          <w:sz w:val="21"/>
-        </w:rPr>
-        <w:t>reports/01_Exploratory_Data_Analysis.pdf</w:t>
-      </w:r>
+        <w:t>01_eda.ipynb</w:t>
+      </w:r>
+      <w:r>
+        <w:rPr>
+          <w:rFonts w:ascii="Calibri" w:hAnsi="Calibri"/>
+          <w:sz w:val="21"/>
+        </w:rPr>
+        <w:t xml:space="preserve">  ·  notebook: </w:t>
+      </w:r>
+      <w:hyperlink r:id="rId23">
+        <w:r>
+          <w:rPr>
+            <w:rFonts w:ascii="Calibri" w:hAnsi="Calibri"/>
+            <w:color w:val="1F4E79"/>
+            <w:u w:val="single"/>
+            <w:sz w:val="21"/>
+          </w:rPr>
+          <w:t xml:space="preserve">https://github.com/2025cs05050-rgb/heart-disease-mlops/blob/main/notebooks/01_eda.ipynb</w:t>
+        </w:r>
+      </w:hyperlink>
+      <w:r>
+        <w:rPr>
+          <w:rFonts w:ascii="Calibri" w:hAnsi="Calibri"/>
+          <w:sz w:val="21"/>
+        </w:rPr>
+        <w:t xml:space="preserve">  ·  PDF: </w:t>
+      </w:r>
+      <w:hyperlink r:id="rId24">
+        <w:r>
+          <w:rPr>
+            <w:rFonts w:ascii="Calibri" w:hAnsi="Calibri"/>
+            <w:color w:val="1F4E79"/>
+            <w:u w:val="single"/>
+            <w:sz w:val="21"/>
+          </w:rPr>
+          <w:t xml:space="preserve">https://github.com/2025cs05050-rgb/heart-disease-mlops/blob/main/reports/01_Exploratory_Data_Analysis.pdf</w:t>
+        </w:r>
+      </w:hyperlink>
     </w:p>
     <w:p>
       <w:pPr>
@@ -5884,22 +5932,44 @@
           <w:rFonts w:ascii="Consolas" w:hAnsi="Consolas"/>
           <w:sz w:val="21"/>
         </w:rPr>
-        <w:t>notebooks/02_preprocessing.ipynb</w:t>
-      </w:r>
-      <w:r>
-        <w:rPr>
-          <w:rFonts w:ascii="Calibri" w:hAnsi="Calibri"/>
-          <w:sz w:val="21"/>
-        </w:rPr>
-        <w:t xml:space="preserve"> — </w:t>
-      </w:r>
-      <w:r>
-        <w:rPr>
-          <w:rFonts w:ascii="Consolas" w:hAnsi="Consolas"/>
-          <w:sz w:val="21"/>
-        </w:rPr>
-        <w:t>reports/02_Preprocessing.pdf</w:t>
-      </w:r>
+        <w:t>02_preprocessing.ipynb</w:t>
+      </w:r>
+      <w:r>
+        <w:rPr>
+          <w:rFonts w:ascii="Calibri" w:hAnsi="Calibri"/>
+          <w:sz w:val="21"/>
+        </w:rPr>
+        <w:t xml:space="preserve">  ·  notebook: </w:t>
+      </w:r>
+      <w:hyperlink r:id="rId25">
+        <w:r>
+          <w:rPr>
+            <w:rFonts w:ascii="Calibri" w:hAnsi="Calibri"/>
+            <w:color w:val="1F4E79"/>
+            <w:u w:val="single"/>
+            <w:sz w:val="21"/>
+          </w:rPr>
+          <w:t xml:space="preserve">https://github.com/2025cs05050-rgb/heart-disease-mlops/blob/main/notebooks/02_preprocessing.ipynb</w:t>
+        </w:r>
+      </w:hyperlink>
+      <w:r>
+        <w:rPr>
+          <w:rFonts w:ascii="Calibri" w:hAnsi="Calibri"/>
+          <w:sz w:val="21"/>
+        </w:rPr>
+        <w:t xml:space="preserve">  ·  PDF: </w:t>
+      </w:r>
+      <w:hyperlink r:id="rId26">
+        <w:r>
+          <w:rPr>
+            <w:rFonts w:ascii="Calibri" w:hAnsi="Calibri"/>
+            <w:color w:val="1F4E79"/>
+            <w:u w:val="single"/>
+            <w:sz w:val="21"/>
+          </w:rPr>
+          <w:t xml:space="preserve">https://github.com/2025cs05050-rgb/heart-disease-mlops/blob/main/reports/02_Preprocessing.pdf</w:t>
+        </w:r>
+      </w:hyperlink>
     </w:p>
     <w:p>
       <w:pPr>
@@ -5915,22 +5985,44 @@
           <w:rFonts w:ascii="Consolas" w:hAnsi="Consolas"/>
           <w:sz w:val="21"/>
         </w:rPr>
-        <w:t>notebooks/03_model_training.ipynb</w:t>
-      </w:r>
-      <w:r>
-        <w:rPr>
-          <w:rFonts w:ascii="Calibri" w:hAnsi="Calibri"/>
-          <w:sz w:val="21"/>
-        </w:rPr>
-        <w:t xml:space="preserve"> — </w:t>
-      </w:r>
-      <w:r>
-        <w:rPr>
-          <w:rFonts w:ascii="Consolas" w:hAnsi="Consolas"/>
-          <w:sz w:val="21"/>
-        </w:rPr>
-        <w:t>reports/03_Model_Training.pdf</w:t>
-      </w:r>
+        <w:t>03_model_training.ipynb</w:t>
+      </w:r>
+      <w:r>
+        <w:rPr>
+          <w:rFonts w:ascii="Calibri" w:hAnsi="Calibri"/>
+          <w:sz w:val="21"/>
+        </w:rPr>
+        <w:t xml:space="preserve">  ·  notebook: </w:t>
+      </w:r>
+      <w:hyperlink r:id="rId27">
+        <w:r>
+          <w:rPr>
+            <w:rFonts w:ascii="Calibri" w:hAnsi="Calibri"/>
+            <w:color w:val="1F4E79"/>
+            <w:u w:val="single"/>
+            <w:sz w:val="21"/>
+          </w:rPr>
+          <w:t xml:space="preserve">https://github.com/2025cs05050-rgb/heart-disease-mlops/blob/main/notebooks/03_model_training.ipynb</w:t>
+        </w:r>
+      </w:hyperlink>
+      <w:r>
+        <w:rPr>
+          <w:rFonts w:ascii="Calibri" w:hAnsi="Calibri"/>
+          <w:sz w:val="21"/>
+        </w:rPr>
+        <w:t xml:space="preserve">  ·  PDF: </w:t>
+      </w:r>
+      <w:hyperlink r:id="rId28">
+        <w:r>
+          <w:rPr>
+            <w:rFonts w:ascii="Calibri" w:hAnsi="Calibri"/>
+            <w:color w:val="1F4E79"/>
+            <w:u w:val="single"/>
+            <w:sz w:val="21"/>
+          </w:rPr>
+          <w:t xml:space="preserve">https://github.com/2025cs05050-rgb/heart-disease-mlops/blob/main/reports/03_Model_Training.pdf</w:t>
+        </w:r>
+      </w:hyperlink>
     </w:p>
     <w:p>
       <w:pPr>
@@ -5946,22 +6038,44 @@
           <w:rFonts w:ascii="Consolas" w:hAnsi="Consolas"/>
           <w:sz w:val="21"/>
         </w:rPr>
-        <w:t>notebooks/04_inference.ipynb</w:t>
-      </w:r>
-      <w:r>
-        <w:rPr>
-          <w:rFonts w:ascii="Calibri" w:hAnsi="Calibri"/>
-          <w:sz w:val="21"/>
-        </w:rPr>
-        <w:t xml:space="preserve"> — </w:t>
-      </w:r>
-      <w:r>
-        <w:rPr>
-          <w:rFonts w:ascii="Consolas" w:hAnsi="Consolas"/>
-          <w:sz w:val="21"/>
-        </w:rPr>
-        <w:t>reports/04_Inference.pdf</w:t>
-      </w:r>
+        <w:t>04_inference.ipynb</w:t>
+      </w:r>
+      <w:r>
+        <w:rPr>
+          <w:rFonts w:ascii="Calibri" w:hAnsi="Calibri"/>
+          <w:sz w:val="21"/>
+        </w:rPr>
+        <w:t xml:space="preserve">  ·  notebook: </w:t>
+      </w:r>
+      <w:hyperlink r:id="rId29">
+        <w:r>
+          <w:rPr>
+            <w:rFonts w:ascii="Calibri" w:hAnsi="Calibri"/>
+            <w:color w:val="1F4E79"/>
+            <w:u w:val="single"/>
+            <w:sz w:val="21"/>
+          </w:rPr>
+          <w:t xml:space="preserve">https://github.com/2025cs05050-rgb/heart-disease-mlops/blob/main/notebooks/04_inference.ipynb</w:t>
+        </w:r>
+      </w:hyperlink>
+      <w:r>
+        <w:rPr>
+          <w:rFonts w:ascii="Calibri" w:hAnsi="Calibri"/>
+          <w:sz w:val="21"/>
+        </w:rPr>
+        <w:t xml:space="preserve">  ·  PDF: </w:t>
+      </w:r>
+      <w:hyperlink r:id="rId30">
+        <w:r>
+          <w:rPr>
+            <w:rFonts w:ascii="Calibri" w:hAnsi="Calibri"/>
+            <w:color w:val="1F4E79"/>
+            <w:u w:val="single"/>
+            <w:sz w:val="21"/>
+          </w:rPr>
+          <w:t xml:space="preserve">https://github.com/2025cs05050-rgb/heart-disease-mlops/blob/main/reports/04_Inference.pdf</w:t>
+        </w:r>
+      </w:hyperlink>
     </w:p>
     <w:p>
       <w:pPr>
@@ -5977,22 +6091,44 @@
           <w:rFonts w:ascii="Consolas" w:hAnsi="Consolas"/>
           <w:sz w:val="21"/>
         </w:rPr>
-        <w:t>notebooks/05_containerisation.ipynb</w:t>
-      </w:r>
-      <w:r>
-        <w:rPr>
-          <w:rFonts w:ascii="Calibri" w:hAnsi="Calibri"/>
-          <w:sz w:val="21"/>
-        </w:rPr>
-        <w:t xml:space="preserve"> — </w:t>
-      </w:r>
-      <w:r>
-        <w:rPr>
-          <w:rFonts w:ascii="Consolas" w:hAnsi="Consolas"/>
-          <w:sz w:val="21"/>
-        </w:rPr>
-        <w:t>reports/05_Containerisation.pdf</w:t>
-      </w:r>
+        <w:t>05_containerisation.ipynb</w:t>
+      </w:r>
+      <w:r>
+        <w:rPr>
+          <w:rFonts w:ascii="Calibri" w:hAnsi="Calibri"/>
+          <w:sz w:val="21"/>
+        </w:rPr>
+        <w:t xml:space="preserve">  ·  notebook: </w:t>
+      </w:r>
+      <w:hyperlink r:id="rId31">
+        <w:r>
+          <w:rPr>
+            <w:rFonts w:ascii="Calibri" w:hAnsi="Calibri"/>
+            <w:color w:val="1F4E79"/>
+            <w:u w:val="single"/>
+            <w:sz w:val="21"/>
+          </w:rPr>
+          <w:t xml:space="preserve">https://github.com/2025cs05050-rgb/heart-disease-mlops/blob/main/notebooks/05_containerisation.ipynb</w:t>
+        </w:r>
+      </w:hyperlink>
+      <w:r>
+        <w:rPr>
+          <w:rFonts w:ascii="Calibri" w:hAnsi="Calibri"/>
+          <w:sz w:val="21"/>
+        </w:rPr>
+        <w:t xml:space="preserve">  ·  PDF: </w:t>
+      </w:r>
+      <w:hyperlink r:id="rId32">
+        <w:r>
+          <w:rPr>
+            <w:rFonts w:ascii="Calibri" w:hAnsi="Calibri"/>
+            <w:color w:val="1F4E79"/>
+            <w:u w:val="single"/>
+            <w:sz w:val="21"/>
+          </w:rPr>
+          <w:t xml:space="preserve">https://github.com/2025cs05050-rgb/heart-disease-mlops/blob/main/reports/05_Containerisation.pdf</w:t>
+        </w:r>
+      </w:hyperlink>
     </w:p>
     <w:p>
       <w:pPr>
@@ -6008,22 +6144,44 @@
           <w:rFonts w:ascii="Consolas" w:hAnsi="Consolas"/>
           <w:sz w:val="21"/>
         </w:rPr>
-        <w:t>notebooks/06_kubernetes.ipynb</w:t>
-      </w:r>
-      <w:r>
-        <w:rPr>
-          <w:rFonts w:ascii="Calibri" w:hAnsi="Calibri"/>
-          <w:sz w:val="21"/>
-        </w:rPr>
-        <w:t xml:space="preserve"> — </w:t>
-      </w:r>
-      <w:r>
-        <w:rPr>
-          <w:rFonts w:ascii="Consolas" w:hAnsi="Consolas"/>
-          <w:sz w:val="21"/>
-        </w:rPr>
-        <w:t>reports/06_Kubernetes.pdf</w:t>
-      </w:r>
+        <w:t>06_kubernetes.ipynb</w:t>
+      </w:r>
+      <w:r>
+        <w:rPr>
+          <w:rFonts w:ascii="Calibri" w:hAnsi="Calibri"/>
+          <w:sz w:val="21"/>
+        </w:rPr>
+        <w:t xml:space="preserve">  ·  notebook: </w:t>
+      </w:r>
+      <w:hyperlink r:id="rId33">
+        <w:r>
+          <w:rPr>
+            <w:rFonts w:ascii="Calibri" w:hAnsi="Calibri"/>
+            <w:color w:val="1F4E79"/>
+            <w:u w:val="single"/>
+            <w:sz w:val="21"/>
+          </w:rPr>
+          <w:t xml:space="preserve">https://github.com/2025cs05050-rgb/heart-disease-mlops/blob/main/notebooks/06_kubernetes.ipynb</w:t>
+        </w:r>
+      </w:hyperlink>
+      <w:r>
+        <w:rPr>
+          <w:rFonts w:ascii="Calibri" w:hAnsi="Calibri"/>
+          <w:sz w:val="21"/>
+        </w:rPr>
+        <w:t xml:space="preserve">  ·  PDF: </w:t>
+      </w:r>
+      <w:hyperlink r:id="rId34">
+        <w:r>
+          <w:rPr>
+            <w:rFonts w:ascii="Calibri" w:hAnsi="Calibri"/>
+            <w:color w:val="1F4E79"/>
+            <w:u w:val="single"/>
+            <w:sz w:val="21"/>
+          </w:rPr>
+          <w:t xml:space="preserve">https://github.com/2025cs05050-rgb/heart-disease-mlops/blob/main/reports/06_Kubernetes.pdf</w:t>
+        </w:r>
+      </w:hyperlink>
     </w:p>
     <w:p>
       <w:pPr>
@@ -6039,22 +6197,44 @@
           <w:rFonts w:ascii="Consolas" w:hAnsi="Consolas"/>
           <w:sz w:val="21"/>
         </w:rPr>
-        <w:t>notebooks/07_monitoring.ipynb</w:t>
-      </w:r>
-      <w:r>
-        <w:rPr>
-          <w:rFonts w:ascii="Calibri" w:hAnsi="Calibri"/>
-          <w:sz w:val="21"/>
-        </w:rPr>
-        <w:t xml:space="preserve"> — </w:t>
-      </w:r>
-      <w:r>
-        <w:rPr>
-          <w:rFonts w:ascii="Consolas" w:hAnsi="Consolas"/>
-          <w:sz w:val="21"/>
-        </w:rPr>
-        <w:t>reports/07_Monitoring.pdf</w:t>
-      </w:r>
+        <w:t>07_monitoring.ipynb</w:t>
+      </w:r>
+      <w:r>
+        <w:rPr>
+          <w:rFonts w:ascii="Calibri" w:hAnsi="Calibri"/>
+          <w:sz w:val="21"/>
+        </w:rPr>
+        <w:t xml:space="preserve">  ·  notebook: </w:t>
+      </w:r>
+      <w:hyperlink r:id="rId35">
+        <w:r>
+          <w:rPr>
+            <w:rFonts w:ascii="Calibri" w:hAnsi="Calibri"/>
+            <w:color w:val="1F4E79"/>
+            <w:u w:val="single"/>
+            <w:sz w:val="21"/>
+          </w:rPr>
+          <w:t xml:space="preserve">https://github.com/2025cs05050-rgb/heart-disease-mlops/blob/main/notebooks/07_monitoring.ipynb</w:t>
+        </w:r>
+      </w:hyperlink>
+      <w:r>
+        <w:rPr>
+          <w:rFonts w:ascii="Calibri" w:hAnsi="Calibri"/>
+          <w:sz w:val="21"/>
+        </w:rPr>
+        <w:t xml:space="preserve">  ·  PDF: </w:t>
+      </w:r>
+      <w:hyperlink r:id="rId36">
+        <w:r>
+          <w:rPr>
+            <w:rFonts w:ascii="Calibri" w:hAnsi="Calibri"/>
+            <w:color w:val="1F4E79"/>
+            <w:u w:val="single"/>
+            <w:sz w:val="21"/>
+          </w:rPr>
+          <w:t xml:space="preserve">https://github.com/2025cs05050-rgb/heart-disease-mlops/blob/main/reports/07_Monitoring.pdf</w:t>
+        </w:r>
+      </w:hyperlink>
     </w:p>
     <w:p>
       <w:pPr>
@@ -6079,13 +6259,17 @@
           <w:numId w:val="1"/>
         </w:numPr>
       </w:pPr>
-      <w:r>
-        <w:rPr>
-          <w:rFonts w:ascii="Consolas" w:hAnsi="Consolas"/>
-          <w:sz w:val="21"/>
-        </w:rPr>
-        <w:t>src/data_loader.py</w:t>
-      </w:r>
+      <w:hyperlink r:id="rId37">
+        <w:r>
+          <w:rPr>
+            <w:rFonts w:ascii="Calibri" w:hAnsi="Calibri"/>
+            <w:color w:val="1F4E79"/>
+            <w:u w:val="single"/>
+            <w:sz w:val="21"/>
+          </w:rPr>
+          <w:t xml:space="preserve">src/data_loader.py</w:t>
+        </w:r>
+      </w:hyperlink>
       <w:r>
         <w:rPr>
           <w:rFonts w:ascii="Calibri" w:hAnsi="Calibri"/>
@@ -6093,13 +6277,17 @@
         </w:rPr>
         <w:t xml:space="preserve">, </w:t>
       </w:r>
-      <w:r>
-        <w:rPr>
-          <w:rFonts w:ascii="Consolas" w:hAnsi="Consolas"/>
-          <w:sz w:val="21"/>
-        </w:rPr>
-        <w:t>src/preprocess.py</w:t>
-      </w:r>
+      <w:hyperlink r:id="rId38">
+        <w:r>
+          <w:rPr>
+            <w:rFonts w:ascii="Calibri" w:hAnsi="Calibri"/>
+            <w:color w:val="1F4E79"/>
+            <w:u w:val="single"/>
+            <w:sz w:val="21"/>
+          </w:rPr>
+          <w:t xml:space="preserve">src/preprocess.py</w:t>
+        </w:r>
+      </w:hyperlink>
       <w:r>
         <w:rPr>
           <w:rFonts w:ascii="Calibri" w:hAnsi="Calibri"/>
@@ -6107,13 +6295,17 @@
         </w:rPr>
         <w:t xml:space="preserve">, </w:t>
       </w:r>
-      <w:r>
-        <w:rPr>
-          <w:rFonts w:ascii="Consolas" w:hAnsi="Consolas"/>
-          <w:sz w:val="21"/>
-        </w:rPr>
-        <w:t>src/train.py</w:t>
-      </w:r>
+      <w:hyperlink r:id="rId39">
+        <w:r>
+          <w:rPr>
+            <w:rFonts w:ascii="Calibri" w:hAnsi="Calibri"/>
+            <w:color w:val="1F4E79"/>
+            <w:u w:val="single"/>
+            <w:sz w:val="21"/>
+          </w:rPr>
+          <w:t xml:space="preserve">src/train.py</w:t>
+        </w:r>
+      </w:hyperlink>
       <w:r>
         <w:rPr>
           <w:rFonts w:ascii="Calibri" w:hAnsi="Calibri"/>
@@ -6121,13 +6313,17 @@
         </w:rPr>
         <w:t xml:space="preserve">, </w:t>
       </w:r>
-      <w:r>
-        <w:rPr>
-          <w:rFonts w:ascii="Consolas" w:hAnsi="Consolas"/>
-          <w:sz w:val="21"/>
-        </w:rPr>
-        <w:t>src/evaluate.py</w:t>
-      </w:r>
+      <w:hyperlink r:id="rId40">
+        <w:r>
+          <w:rPr>
+            <w:rFonts w:ascii="Calibri" w:hAnsi="Calibri"/>
+            <w:color w:val="1F4E79"/>
+            <w:u w:val="single"/>
+            <w:sz w:val="21"/>
+          </w:rPr>
+          <w:t xml:space="preserve">src/evaluate.py</w:t>
+        </w:r>
+      </w:hyperlink>
       <w:r>
         <w:rPr>
           <w:rFonts w:ascii="Calibri" w:hAnsi="Calibri"/>
@@ -6135,13 +6331,17 @@
         </w:rPr>
         <w:t xml:space="preserve">, </w:t>
       </w:r>
-      <w:r>
-        <w:rPr>
-          <w:rFonts w:ascii="Consolas" w:hAnsi="Consolas"/>
-          <w:sz w:val="21"/>
-        </w:rPr>
-        <w:t>src/predict.py</w:t>
-      </w:r>
+      <w:hyperlink r:id="rId41">
+        <w:r>
+          <w:rPr>
+            <w:rFonts w:ascii="Calibri" w:hAnsi="Calibri"/>
+            <w:color w:val="1F4E79"/>
+            <w:u w:val="single"/>
+            <w:sz w:val="21"/>
+          </w:rPr>
+          <w:t xml:space="preserve">src/predict.py</w:t>
+        </w:r>
+      </w:hyperlink>
       <w:r>
         <w:rPr>
           <w:rFonts w:ascii="Calibri" w:hAnsi="Calibri"/>
@@ -6159,13 +6359,17 @@
           <w:numId w:val="1"/>
         </w:numPr>
       </w:pPr>
-      <w:r>
-        <w:rPr>
-          <w:rFonts w:ascii="Consolas" w:hAnsi="Consolas"/>
-          <w:sz w:val="21"/>
-        </w:rPr>
-        <w:t>api/</w:t>
-      </w:r>
+      <w:hyperlink r:id="rId42">
+        <w:r>
+          <w:rPr>
+            <w:rFonts w:ascii="Calibri" w:hAnsi="Calibri"/>
+            <w:color w:val="1F4E79"/>
+            <w:u w:val="single"/>
+            <w:sz w:val="21"/>
+          </w:rPr>
+          <w:t xml:space="preserve">api/</w:t>
+        </w:r>
+      </w:hyperlink>
       <w:r>
         <w:rPr>
           <w:rFonts w:ascii="Calibri" w:hAnsi="Calibri"/>
@@ -6183,13 +6387,17 @@
           <w:numId w:val="1"/>
         </w:numPr>
       </w:pPr>
-      <w:r>
-        <w:rPr>
-          <w:rFonts w:ascii="Consolas" w:hAnsi="Consolas"/>
-          <w:sz w:val="21"/>
-        </w:rPr>
-        <w:t>tests/</w:t>
-      </w:r>
+      <w:hyperlink r:id="rId43">
+        <w:r>
+          <w:rPr>
+            <w:rFonts w:ascii="Calibri" w:hAnsi="Calibri"/>
+            <w:color w:val="1F4E79"/>
+            <w:u w:val="single"/>
+            <w:sz w:val="21"/>
+          </w:rPr>
+          <w:t xml:space="preserve">tests/</w:t>
+        </w:r>
+      </w:hyperlink>
       <w:r>
         <w:rPr>
           <w:rFonts w:ascii="Calibri" w:hAnsi="Calibri"/>
@@ -6221,13 +6429,17 @@
           <w:numId w:val="1"/>
         </w:numPr>
       </w:pPr>
-      <w:r>
-        <w:rPr>
-          <w:rFonts w:ascii="Consolas" w:hAnsi="Consolas"/>
-          <w:sz w:val="21"/>
-        </w:rPr>
-        <w:t>docker/Dockerfile</w:t>
-      </w:r>
+      <w:hyperlink r:id="rId44">
+        <w:r>
+          <w:rPr>
+            <w:rFonts w:ascii="Calibri" w:hAnsi="Calibri"/>
+            <w:color w:val="1F4E79"/>
+            <w:u w:val="single"/>
+            <w:sz w:val="21"/>
+          </w:rPr>
+          <w:t xml:space="preserve">docker/Dockerfile</w:t>
+        </w:r>
+      </w:hyperlink>
       <w:r>
         <w:rPr>
           <w:rFonts w:ascii="Calibri" w:hAnsi="Calibri"/>
@@ -6245,13 +6457,17 @@
           <w:numId w:val="1"/>
         </w:numPr>
       </w:pPr>
-      <w:r>
-        <w:rPr>
-          <w:rFonts w:ascii="Consolas" w:hAnsi="Consolas"/>
-          <w:sz w:val="21"/>
-        </w:rPr>
-        <w:t>docker/Dockerfile.slim</w:t>
-      </w:r>
+      <w:hyperlink r:id="rId45">
+        <w:r>
+          <w:rPr>
+            <w:rFonts w:ascii="Calibri" w:hAnsi="Calibri"/>
+            <w:color w:val="1F4E79"/>
+            <w:u w:val="single"/>
+            <w:sz w:val="21"/>
+          </w:rPr>
+          <w:t xml:space="preserve">docker/Dockerfile.slim</w:t>
+        </w:r>
+      </w:hyperlink>
       <w:r>
         <w:rPr>
           <w:rFonts w:ascii="Calibri" w:hAnsi="Calibri"/>
@@ -6269,13 +6485,17 @@
           <w:numId w:val="1"/>
         </w:numPr>
       </w:pPr>
-      <w:r>
-        <w:rPr>
-          <w:rFonts w:ascii="Consolas" w:hAnsi="Consolas"/>
-          <w:sz w:val="21"/>
-        </w:rPr>
-        <w:t>k8s/</w:t>
-      </w:r>
+      <w:hyperlink r:id="rId46">
+        <w:r>
+          <w:rPr>
+            <w:rFonts w:ascii="Calibri" w:hAnsi="Calibri"/>
+            <w:color w:val="1F4E79"/>
+            <w:u w:val="single"/>
+            <w:sz w:val="21"/>
+          </w:rPr>
+          <w:t xml:space="preserve">k8s/</w:t>
+        </w:r>
+      </w:hyperlink>
       <w:r>
         <w:rPr>
           <w:rFonts w:ascii="Calibri" w:hAnsi="Calibri"/>
@@ -6293,13 +6513,17 @@
           <w:numId w:val="1"/>
         </w:numPr>
       </w:pPr>
-      <w:r>
-        <w:rPr>
-          <w:rFonts w:ascii="Consolas" w:hAnsi="Consolas"/>
-          <w:sz w:val="21"/>
-        </w:rPr>
-        <w:t>monitoring/</w:t>
-      </w:r>
+      <w:hyperlink r:id="rId47">
+        <w:r>
+          <w:rPr>
+            <w:rFonts w:ascii="Calibri" w:hAnsi="Calibri"/>
+            <w:color w:val="1F4E79"/>
+            <w:u w:val="single"/>
+            <w:sz w:val="21"/>
+          </w:rPr>
+          <w:t xml:space="preserve">monitoring/</w:t>
+        </w:r>
+      </w:hyperlink>
       <w:r>
         <w:rPr>
           <w:rFonts w:ascii="Calibri" w:hAnsi="Calibri"/>
@@ -6317,13 +6541,17 @@
           <w:numId w:val="1"/>
         </w:numPr>
       </w:pPr>
-      <w:r>
-        <w:rPr>
-          <w:rFonts w:ascii="Consolas" w:hAnsi="Consolas"/>
-          <w:sz w:val="21"/>
-        </w:rPr>
-        <w:t>.github/workflows/ci.yml</w:t>
-      </w:r>
+      <w:hyperlink r:id="rId48">
+        <w:r>
+          <w:rPr>
+            <w:rFonts w:ascii="Calibri" w:hAnsi="Calibri"/>
+            <w:color w:val="1F4E79"/>
+            <w:u w:val="single"/>
+            <w:sz w:val="21"/>
+          </w:rPr>
+          <w:t xml:space="preserve">.github/workflows/ci.yml</w:t>
+        </w:r>
+      </w:hyperlink>
       <w:r>
         <w:rPr>
           <w:rFonts w:ascii="Calibri" w:hAnsi="Calibri"/>
@@ -6355,13 +6583,17 @@
           <w:numId w:val="1"/>
         </w:numPr>
       </w:pPr>
-      <w:r>
-        <w:rPr>
-          <w:rFonts w:ascii="Consolas" w:hAnsi="Consolas"/>
-          <w:sz w:val="21"/>
-        </w:rPr>
-        <w:t>reports/MLOps_Assignment1_Report.pdf</w:t>
-      </w:r>
+      <w:hyperlink r:id="rId49">
+        <w:r>
+          <w:rPr>
+            <w:rFonts w:ascii="Calibri" w:hAnsi="Calibri"/>
+            <w:color w:val="1F4E79"/>
+            <w:u w:val="single"/>
+            <w:sz w:val="21"/>
+          </w:rPr>
+          <w:t xml:space="preserve">reports/MLOps_Assignment1_Report.pdf</w:t>
+        </w:r>
+      </w:hyperlink>
       <w:r>
         <w:rPr>
           <w:rFonts w:ascii="Calibri" w:hAnsi="Calibri"/>
@@ -6379,13 +6611,17 @@
           <w:numId w:val="1"/>
         </w:numPr>
       </w:pPr>
-      <w:r>
-        <w:rPr>
-          <w:rFonts w:ascii="Consolas" w:hAnsi="Consolas"/>
-          <w:sz w:val="21"/>
-        </w:rPr>
-        <w:t>reports/MLOps_Assignment1_Report.docx</w:t>
-      </w:r>
+      <w:hyperlink r:id="rId50">
+        <w:r>
+          <w:rPr>
+            <w:rFonts w:ascii="Calibri" w:hAnsi="Calibri"/>
+            <w:color w:val="1F4E79"/>
+            <w:u w:val="single"/>
+            <w:sz w:val="21"/>
+          </w:rPr>
+          <w:t xml:space="preserve">reports/MLOps_Assignment1_Report.docx</w:t>
+        </w:r>
+      </w:hyperlink>
       <w:r>
         <w:rPr>
           <w:rFonts w:ascii="Calibri" w:hAnsi="Calibri"/>
@@ -6403,13 +6639,17 @@
           <w:numId w:val="1"/>
         </w:numPr>
       </w:pPr>
-      <w:r>
-        <w:rPr>
-          <w:rFonts w:ascii="Consolas" w:hAnsi="Consolas"/>
-          <w:sz w:val="21"/>
-        </w:rPr>
-        <w:t>reports/metrics.json</w:t>
-      </w:r>
+      <w:hyperlink r:id="rId51">
+        <w:r>
+          <w:rPr>
+            <w:rFonts w:ascii="Calibri" w:hAnsi="Calibri"/>
+            <w:color w:val="1F4E79"/>
+            <w:u w:val="single"/>
+            <w:sz w:val="21"/>
+          </w:rPr>
+          <w:t xml:space="preserve">reports/metrics.json</w:t>
+        </w:r>
+      </w:hyperlink>
       <w:r>
         <w:rPr>
           <w:rFonts w:ascii="Calibri" w:hAnsi="Calibri"/>
@@ -6427,13 +6667,17 @@
           <w:numId w:val="1"/>
         </w:numPr>
       </w:pPr>
-      <w:r>
-        <w:rPr>
-          <w:rFonts w:ascii="Consolas" w:hAnsi="Consolas"/>
-          <w:sz w:val="21"/>
-        </w:rPr>
-        <w:t>reports/figures/</w:t>
-      </w:r>
+      <w:hyperlink r:id="rId52">
+        <w:r>
+          <w:rPr>
+            <w:rFonts w:ascii="Calibri" w:hAnsi="Calibri"/>
+            <w:color w:val="1F4E79"/>
+            <w:u w:val="single"/>
+            <w:sz w:val="21"/>
+          </w:rPr>
+          <w:t xml:space="preserve">reports/figures/</w:t>
+        </w:r>
+      </w:hyperlink>
       <w:r>
         <w:rPr>
           <w:rFonts w:ascii="Calibri" w:hAnsi="Calibri"/>
@@ -6451,13 +6695,17 @@
           <w:numId w:val="1"/>
         </w:numPr>
       </w:pPr>
-      <w:r>
-        <w:rPr>
-          <w:rFonts w:ascii="Consolas" w:hAnsi="Consolas"/>
-          <w:sz w:val="21"/>
-        </w:rPr>
-        <w:t>screenshots/</w:t>
-      </w:r>
+      <w:hyperlink r:id="rId53">
+        <w:r>
+          <w:rPr>
+            <w:rFonts w:ascii="Calibri" w:hAnsi="Calibri"/>
+            <w:color w:val="1F4E79"/>
+            <w:u w:val="single"/>
+            <w:sz w:val="21"/>
+          </w:rPr>
+          <w:t xml:space="preserve">screenshots/</w:t>
+        </w:r>
+      </w:hyperlink>
       <w:r>
         <w:rPr>
           <w:rFonts w:ascii="Calibri" w:hAnsi="Calibri"/>

</xml_diff>